<commit_message>
Refine application structure with complementary verified design visuals
</commit_message>
<xml_diff>
--- a/deliverables/大创申报书_模板填写稿.docx
+++ b/deliverables/大创申报书_模板填写稿.docx
@@ -1608,7 +1608,7 @@
                 <w:rFonts w:hint="eastAsia" w:ascii="黑体" w:hAnsi="黑体" w:eastAsia="黑体" w:cs="Times New Roman"/>
                 <w:lang w:val="en-US" w:eastAsia="zh-CN"/>
               </w:rPr>
-              <w:t>尚未提供，由本人据实填写，不能照抄案例经历。</w:t>
+              <w:t>由负责人据实填写专业学习、实践经历及实际成果。</w:t>
             </w:r>
           </w:p>
         </w:tc>
@@ -3228,7 +3228,7 @@
                 <w:szCs w:val="28"/>
                 <w:lang w:val="en-US" w:eastAsia="zh-CN"/>
               </w:rPr>
-              <w:t>1 总体架构与运行过程</w:t>
+              <w:t>1 系统组成与任务分工</w:t>
             </w:r>
             <w:r>
               <w:rPr>
@@ -3272,7 +3272,7 @@
                 <w:lang w:val="en-US" w:eastAsia="zh-CN"/>
               </w:rPr>
               <w:pict>
-                <v:shape id="_x0000_i1026" o:spt="75" alt="图1 支管巡检系统组成与独立评价关系 设计方案" type="#_x0000_t75" style="height:249.15pt;width:425pt;" filled="f" o:preferrelative="t" stroked="f" coordsize="21600,21600">
+                <v:shape id="_x0000_i1026" o:spt="75" alt="图1 支管巡检系统组成与独立评价关系 设计方案" type="#_x0000_t75" style="height:212.9pt;width:425pt;" filled="f" o:preferrelative="t" stroked="f" coordsize="21600,21600">
                   <v:path/>
                   <v:fill on="f" focussize="0,0"/>
                   <v:stroke on="f"/>
@@ -3322,7 +3322,7 @@
                 <w:szCs w:val="28"/>
                 <w:lang w:val="en-US" w:eastAsia="zh-CN"/>
               </w:rPr>
-              <w:t>系统闭环截至管理确认，自动阀控不列入本期基础任务。一个节点用于研究一个被监测区段，双支路用于制造共同供水与正常切换条件；它们并不代表已完成多节点田间部署。增加节点和现场适应性试验以资助、许可和测量质量为条件。</w:t>
+              <w:t>系统按感知测量、有限诊断、可靠告警和管理核查四项任务组织，表2分别规定其验证证据。系统闭环截至管理确认，自动阀控不列入本期基础任务。一个节点用于研究一个被监测区段，双支路用于制造共同供水与正常切换条件；它们并不代表已完成多节点田间部署。增加节点和现场适应性试验以资助、许可和测量质量为条件。</w:t>
             </w:r>
           </w:p>
           <w:p>
@@ -3392,7 +3392,7 @@
                 <w:szCs w:val="28"/>
                 <w:lang w:val="en-US" w:eastAsia="zh-CN"/>
               </w:rPr>
-              <w:t>P0位于监测区段入口，P1位于集中受限元件下游，Q位于泄漏旁路与A负载分流之前，记录两者的总流量；B支路连接同一供水源，用于模拟其他轮灌负载或正常切换。A支路逐步打开泄漏旁路模拟等效泄漏，逐步调节受限元件模拟局部阻力增加，分别记录操作、收集量和参考读数。图2用于限定观测区段与两种故障的注入位置。</w:t>
+              <w:t>P0位于监测区段入口，P1位于集中受限元件下游，Q位于泄漏旁路与A负载分流之前，记录两者的总流量；B支路连接同一供水源，用于模拟其他轮灌负载或正常切换。A支路逐步打开泄漏旁路模拟等效泄漏，逐步调节受限元件模拟局部阻力增加，分别记录操作、收集量和参考读数。图2用蓝色、绿色、橙色分别区分供水、正常负载与泄漏路径，限定观测区段与两种故障的注入位置。</w:t>
             </w:r>
           </w:p>
           <w:p>
@@ -3416,7 +3416,7 @@
                 <w:lang w:val="en-US" w:eastAsia="zh-CN"/>
               </w:rPr>
               <w:pict>
-                <v:shape id="_x0000_i1027" o:spt="75" alt="图2 双压力流量布点与双支路台架设计" type="#_x0000_t75" style="height:267.25pt;width:425pt;" filled="f" o:preferrelative="t" stroked="f" coordsize="21600,21600">
+                <v:shape id="_x0000_i1027" o:spt="75" alt="图2 双压力流量布点与双支路台架设计" type="#_x0000_t75" style="height:294.45pt;width:425pt;" filled="f" o:preferrelative="t" stroked="f" coordsize="21600,21600">
                   <v:path/>
                   <v:fill on="f" focussize="0,0"/>
                   <v:stroke on="f"/>
@@ -3471,47 +3471,25 @@
           </w:p>
           <w:p>
             <w:pPr>
-              <w:keepNext/>
+              <w:keepNext w:val="0"/>
               <w:keepLines/>
-              <w:spacing w:before="140" w:beforeLines="50" w:after="100" w:line="240" w:lineRule="auto"/>
+              <w:spacing w:beforeLines="50" w:after="100" w:line="240" w:lineRule="auto"/>
               <w:jc w:val="left"/>
               <w:rPr>
                 <w:rFonts w:hint="default" w:ascii="Times New Roman" w:hAnsi="Times New Roman" w:eastAsia="宋体" w:cs="Times New Roman"/>
-                <w:b w:val="0"/>
-                <w:sz w:val="21"/>
-                <w:szCs w:val="28"/>
-                <w:lang w:val="en-US" w:eastAsia="zh-CN"/>
-              </w:rPr>
-            </w:pPr>
-            <w:r>
-              <w:rPr>
-                <w:rFonts w:hint="default" w:ascii="Times New Roman" w:hAnsi="Times New Roman" w:eastAsia="宋体" w:cs="Times New Roman"/>
-                <w:b/>
-                <w:sz w:val="21"/>
-                <w:szCs w:val="28"/>
-                <w:lang w:val="en-US" w:eastAsia="zh-CN"/>
-              </w:rPr>
-              <w:t>2.2 节点硬件与数据采集</w:t>
-            </w:r>
-            <w:r>
-              <w:rPr>
-                <w:rFonts w:hint="default" w:ascii="Times New Roman" w:hAnsi="Times New Roman" w:eastAsia="宋体" w:cs="Times New Roman"/>
-                <w:b w:val="0"/>
-                <w:sz w:val="21"/>
-                <w:szCs w:val="28"/>
-                <w:lang w:val="en-US" w:eastAsia="zh-CN"/>
-              </w:rPr>
-              <w:br w:type="textWrapping"/>
-            </w:r>
-            <w:r>
-              <w:rPr>
-                <w:rFonts w:hint="default" w:ascii="Times New Roman" w:hAnsi="Times New Roman" w:eastAsia="宋体" w:cs="Times New Roman"/>
-                <w:b w:val="0"/>
-                <w:sz w:val="21"/>
-                <w:szCs w:val="28"/>
-                <w:lang w:val="en-US" w:eastAsia="zh-CN"/>
-              </w:rPr>
-              <w:t>节点主控拟采用STM32F103C8T6最小系统板，压力经电流采样电阻和ADS1115接入I²C，流量经电平转换接入定时计数，LoRa经UART连接，microSD经SPI保存原始记录。接收端采用另一只LoRa模块与3.3V USB-TTL连接已有电脑，以Python串口接收、SQLite存储和本地Web提供查看确认。该配置先完成开发板原型，减少自制PCB与第二主控的开发负担。图3给出拟实施连接关系。</w:t>
+                <w:sz w:val="21"/>
+                <w:szCs w:val="28"/>
+                <w:lang w:val="en-US" w:eastAsia="zh-CN"/>
+              </w:rPr>
+            </w:pPr>
+            <w:r>
+              <w:rPr>
+                <w:rFonts w:hint="default" w:ascii="Times New Roman" w:hAnsi="Times New Roman" w:eastAsia="宋体" w:cs="Times New Roman"/>
+                <w:sz w:val="21"/>
+                <w:szCs w:val="28"/>
+                <w:lang w:val="en-US" w:eastAsia="zh-CN"/>
+              </w:rPr>
+              <w:t>台架的物理布置与水力关系分别论证。图3按暂定900×520mm底板建立三维几何布局，将水路、侧向测压、独立计量杯和前侧干区节点分开，检查测点先后、操作可达性及回水路径。模型保留可复算几何源，管径、接头及器件包络目前是占位参数；采购后须校核装配尺寸、检修间距、固定与电气防护。这是已生成的设计模型，尚未制成台架。</w:t>
             </w:r>
           </w:p>
           <w:p>
@@ -3535,11 +3513,11 @@
                 <w:lang w:val="en-US" w:eastAsia="zh-CN"/>
               </w:rPr>
               <w:pict>
-                <v:shape id="_x0000_i1028" o:spt="75" alt="图3 感知节点功能连接设计" type="#_x0000_t75" style="height:276.35pt;width:425pt;" filled="f" o:preferrelative="t" stroked="f" coordsize="21600,21600">
+                <v:shape id="_x0000_i1028" o:spt="75" alt="图3 双支路清水台架三维布置概念 器件尺寸待核定" type="#_x0000_t75" style="height:299pt;width:425pt;" filled="f" o:preferrelative="t" stroked="f" coordsize="21600,21600">
                   <v:path/>
                   <v:fill on="f" focussize="0,0"/>
                   <v:stroke on="f"/>
-                  <v:imagedata r:id="rId8" o:title="hardware_node"/>
+                  <v:imagedata r:id="rId8" o:title="bench_model"/>
                   <o:lock v:ext="edit" aspectratio="t"/>
                   <w10:wrap type="none"/>
                   <w10:anchorlock/>
@@ -3562,30 +3540,52 @@
                 <w:szCs w:val="28"/>
                 <w:lang w:val="en-US" w:eastAsia="zh-CN"/>
               </w:rPr>
-              <w:t>图3 感知节点功能连接设计</w:t>
-            </w:r>
-          </w:p>
-          <w:p>
-            <w:pPr>
-              <w:keepNext w:val="0"/>
+              <w:t>图3 双支路清水台架三维布置概念 器件尺寸待核定</w:t>
+            </w:r>
+          </w:p>
+          <w:p>
+            <w:pPr>
+              <w:keepNext/>
               <w:keepLines/>
-              <w:spacing w:beforeLines="50" w:after="100" w:line="240" w:lineRule="auto"/>
+              <w:spacing w:before="140" w:beforeLines="50" w:after="100" w:line="240" w:lineRule="auto"/>
               <w:jc w:val="left"/>
               <w:rPr>
                 <w:rFonts w:hint="default" w:ascii="Times New Roman" w:hAnsi="Times New Roman" w:eastAsia="宋体" w:cs="Times New Roman"/>
-                <w:sz w:val="21"/>
-                <w:szCs w:val="28"/>
-                <w:lang w:val="en-US" w:eastAsia="zh-CN"/>
-              </w:rPr>
-            </w:pPr>
-            <w:r>
-              <w:rPr>
-                <w:rFonts w:hint="default" w:ascii="Times New Roman" w:hAnsi="Times New Roman" w:eastAsia="宋体" w:cs="Times New Roman"/>
-                <w:sz w:val="21"/>
-                <w:szCs w:val="28"/>
-                <w:lang w:val="en-US" w:eastAsia="zh-CN"/>
-              </w:rPr>
-              <w:t>表1列出国内有供应资料的候选器件。型号按接口、测量范围和报价核定后冻结，尚未采购或完成接线。图4为供应商产品配图，用于说明候选形态及安装接口，不是本项目样机照片。</w:t>
+                <w:b w:val="0"/>
+                <w:sz w:val="21"/>
+                <w:szCs w:val="28"/>
+                <w:lang w:val="en-US" w:eastAsia="zh-CN"/>
+              </w:rPr>
+            </w:pPr>
+            <w:r>
+              <w:rPr>
+                <w:rFonts w:hint="default" w:ascii="Times New Roman" w:hAnsi="Times New Roman" w:eastAsia="宋体" w:cs="Times New Roman"/>
+                <w:b/>
+                <w:sz w:val="21"/>
+                <w:szCs w:val="28"/>
+                <w:lang w:val="en-US" w:eastAsia="zh-CN"/>
+              </w:rPr>
+              <w:t>2.2 节点硬件与数据采集</w:t>
+            </w:r>
+            <w:r>
+              <w:rPr>
+                <w:rFonts w:hint="default" w:ascii="Times New Roman" w:hAnsi="Times New Roman" w:eastAsia="宋体" w:cs="Times New Roman"/>
+                <w:b w:val="0"/>
+                <w:sz w:val="21"/>
+                <w:szCs w:val="28"/>
+                <w:lang w:val="en-US" w:eastAsia="zh-CN"/>
+              </w:rPr>
+              <w:br w:type="textWrapping"/>
+            </w:r>
+            <w:r>
+              <w:rPr>
+                <w:rFonts w:hint="default" w:ascii="Times New Roman" w:hAnsi="Times New Roman" w:eastAsia="宋体" w:cs="Times New Roman"/>
+                <w:b w:val="0"/>
+                <w:sz w:val="21"/>
+                <w:szCs w:val="28"/>
+                <w:lang w:val="en-US" w:eastAsia="zh-CN"/>
+              </w:rPr>
+              <w:t>节点主控拟采用STM32F103C8T6最小系统板，压力经电流采样电阻和ADS1115接入I²C，流量经电平转换接入定时计数，LoRa经UART连接，microSD经SPI保存原始记录。接收端采用另一只LoRa模块与3.3V USB-TTL连接已有电脑，以Python串口接收、SQLite存储和本地Web提供查看确认。该配置先完成开发板原型，减少自制PCB与第二主控的开发负担。各接口及采购约束集中列于表1，图4专门论证双压力模拟前端。</w:t>
             </w:r>
           </w:p>
           <w:p>
@@ -3609,11 +3609,11 @@
                 <w:lang w:val="en-US" w:eastAsia="zh-CN"/>
               </w:rPr>
               <w:pict>
-                <v:shape id="_x0000_i1029" o:spt="75" alt="图4 国内供应商候选器件配图 尚未采购 非本项目样机" type="#_x0000_t75" style="height:173.35pt;width:425pt;" filled="f" o:preferrelative="t" stroked="f" coordsize="21600,21600">
+                <v:shape id="_x0000_i1029" o:spt="75" alt="图4 两线制压力变送器与双通道ADC采集原理 保护元件待验证" type="#_x0000_t75" style="height:271.8pt;width:425pt;" filled="f" o:preferrelative="t" stroked="f" coordsize="21600,21600">
                   <v:path/>
                   <v:fill on="f" focussize="0,0"/>
                   <v:stroke on="f"/>
-                  <v:imagedata r:id="rId9" o:title="hardware_candidates"/>
+                  <v:imagedata r:id="rId9" o:title="pressure_frontend"/>
                   <o:lock v:ext="edit" aspectratio="t"/>
                   <w10:wrap type="none"/>
                   <w10:anchorlock/>
@@ -3636,7 +3636,53 @@
                 <w:szCs w:val="28"/>
                 <w:lang w:val="en-US" w:eastAsia="zh-CN"/>
               </w:rPr>
-              <w:t>图4 国内供应商候选器件配图 尚未采购 非本项目样机</w:t>
+              <w:t>图4 两线制压力变送器与双通道ADC采集原理 保护元件待验证</w:t>
+            </w:r>
+          </w:p>
+          <w:p>
+            <w:pPr>
+              <w:keepNext w:val="0"/>
+              <w:keepLines/>
+              <w:spacing w:beforeLines="50" w:after="100" w:line="240" w:lineRule="auto"/>
+              <w:jc w:val="left"/>
+              <w:rPr>
+                <w:rFonts w:hint="default" w:ascii="Times New Roman" w:hAnsi="Times New Roman" w:eastAsia="宋体" w:cs="Times New Roman"/>
+                <w:sz w:val="21"/>
+                <w:szCs w:val="28"/>
+                <w:lang w:val="en-US" w:eastAsia="zh-CN"/>
+              </w:rPr>
+            </w:pPr>
+            <w:r>
+              <w:rPr>
+                <w:rFonts w:hint="default" w:ascii="Times New Roman" w:hAnsi="Times New Roman" w:eastAsia="宋体" w:cs="Times New Roman"/>
+                <w:sz w:val="21"/>
+                <w:szCs w:val="28"/>
+                <w:lang w:val="en-US" w:eastAsia="zh-CN"/>
+              </w:rPr>
+              <w:t>依据MPM489选型资料的两线制4—20mA输出，拟用24V供电及150Ω精密采样电阻，把电流转换为0.6—3.0V；满量程电阻耗散为0.06W。候选电阻暂按0.1%公差、额定功率不低于0.25W选取，误差与温漂仍纳入标定。ADS1115拟以3.3V供电、±4.096V增益档分时采集，两路保留各自转换时间。增益档不扩大引脚允许电压范围，限流、保护、故障电流及共地布局需按器件手册设计并实测。图4是台架采集原理，尚非已验证PCB或现场隔离防雷设计。</w:t>
+            </w:r>
+          </w:p>
+          <w:p>
+            <w:pPr>
+              <w:keepNext w:val="0"/>
+              <w:keepLines/>
+              <w:spacing w:beforeLines="50" w:after="100" w:line="240" w:lineRule="auto"/>
+              <w:jc w:val="left"/>
+              <w:rPr>
+                <w:rFonts w:hint="default" w:ascii="Times New Roman" w:hAnsi="Times New Roman" w:eastAsia="宋体" w:cs="Times New Roman"/>
+                <w:sz w:val="21"/>
+                <w:szCs w:val="28"/>
+                <w:lang w:val="en-US" w:eastAsia="zh-CN"/>
+              </w:rPr>
+            </w:pPr>
+            <w:r>
+              <w:rPr>
+                <w:rFonts w:hint="default" w:ascii="Times New Roman" w:hAnsi="Times New Roman" w:eastAsia="宋体" w:cs="Times New Roman"/>
+                <w:sz w:val="21"/>
+                <w:szCs w:val="28"/>
+                <w:lang w:val="en-US" w:eastAsia="zh-CN"/>
+              </w:rPr>
+              <w:t>表1列出国内有供应资料的候选器件。型号按接口、测量范围和报价核定后冻结，尚未采购或完成接线。厂家资料、候选产品配图和国内采购入口保留在配套选型记录与网站，产品外观不作为本项目样机成果。</w:t>
             </w:r>
           </w:p>
           <w:tbl>
@@ -3733,9 +3779,9 @@
                     </w:tblBorders>
                     <w:tblLayout w:type="fixed"/>
                     <w:tblCellMar>
-                      <w:top w:w="100" w:type="dxa"/>
+                      <w:top w:w="60" w:type="dxa"/>
                       <w:left w:w="100" w:type="dxa"/>
-                      <w:bottom w:w="100" w:type="dxa"/>
+                      <w:bottom w:w="60" w:type="dxa"/>
                       <w:right w:w="100" w:type="dxa"/>
                     </w:tblCellMar>
                   </w:tblPr>
@@ -3755,9 +3801,9 @@
                         <w:insideV w:val="single" w:color="D9D9D9" w:sz="2" w:space="0"/>
                       </w:tblBorders>
                       <w:tblCellMar>
-                        <w:top w:w="100" w:type="dxa"/>
+                        <w:top w:w="60" w:type="dxa"/>
                         <w:left w:w="100" w:type="dxa"/>
-                        <w:bottom w:w="100" w:type="dxa"/>
+                        <w:bottom w:w="60" w:type="dxa"/>
                         <w:right w:w="100" w:type="dxa"/>
                       </w:tblCellMar>
                     </w:tblPrEx>
@@ -3779,7 +3825,7 @@
                         <w:pPr>
                           <w:keepNext/>
                           <w:keepLines/>
-                          <w:spacing w:beforeLines="50" w:after="80" w:line="240" w:lineRule="auto"/>
+                          <w:spacing w:beforeLines="50" w:after="40" w:line="240" w:lineRule="auto"/>
                           <w:jc w:val="left"/>
                           <w:rPr>
                             <w:rFonts w:hint="default" w:ascii="Times New Roman" w:hAnsi="Times New Roman" w:eastAsia="宋体" w:cs="Times New Roman"/>
@@ -3817,7 +3863,7 @@
                         <w:pPr>
                           <w:keepNext/>
                           <w:keepLines/>
-                          <w:spacing w:beforeLines="50" w:after="80" w:line="240" w:lineRule="auto"/>
+                          <w:spacing w:beforeLines="50" w:after="40" w:line="240" w:lineRule="auto"/>
                           <w:jc w:val="left"/>
                           <w:rPr>
                             <w:rFonts w:hint="default" w:ascii="Times New Roman" w:hAnsi="Times New Roman" w:eastAsia="宋体" w:cs="Times New Roman"/>
@@ -3855,7 +3901,7 @@
                         <w:pPr>
                           <w:keepNext/>
                           <w:keepLines/>
-                          <w:spacing w:beforeLines="50" w:after="80" w:line="240" w:lineRule="auto"/>
+                          <w:spacing w:beforeLines="50" w:after="40" w:line="240" w:lineRule="auto"/>
                           <w:jc w:val="left"/>
                           <w:rPr>
                             <w:rFonts w:hint="default" w:ascii="Times New Roman" w:hAnsi="Times New Roman" w:eastAsia="宋体" w:cs="Times New Roman"/>
@@ -3891,9 +3937,9 @@
                         <w:insideV w:val="single" w:color="D9D9D9" w:sz="2" w:space="0"/>
                       </w:tblBorders>
                       <w:tblCellMar>
-                        <w:top w:w="100" w:type="dxa"/>
+                        <w:top w:w="60" w:type="dxa"/>
                         <w:left w:w="100" w:type="dxa"/>
-                        <w:bottom w:w="100" w:type="dxa"/>
+                        <w:bottom w:w="60" w:type="dxa"/>
                         <w:right w:w="100" w:type="dxa"/>
                       </w:tblCellMar>
                     </w:tblPrEx>
@@ -3914,7 +3960,7 @@
                         <w:pPr>
                           <w:keepNext/>
                           <w:keepLines/>
-                          <w:spacing w:beforeLines="50" w:after="80" w:line="240" w:lineRule="auto"/>
+                          <w:spacing w:beforeLines="50" w:after="40" w:line="240" w:lineRule="auto"/>
                           <w:jc w:val="left"/>
                           <w:rPr>
                             <w:rFonts w:hint="default" w:ascii="Times New Roman" w:hAnsi="Times New Roman" w:eastAsia="宋体" w:cs="Times New Roman"/>
@@ -3952,7 +3998,7 @@
                         <w:pPr>
                           <w:keepNext/>
                           <w:keepLines/>
-                          <w:spacing w:beforeLines="50" w:after="80" w:line="240" w:lineRule="auto"/>
+                          <w:spacing w:beforeLines="50" w:after="40" w:line="240" w:lineRule="auto"/>
                           <w:jc w:val="left"/>
                           <w:rPr>
                             <w:rFonts w:hint="default" w:ascii="Times New Roman" w:hAnsi="Times New Roman" w:eastAsia="宋体" w:cs="Times New Roman"/>
@@ -3990,7 +4036,7 @@
                         <w:pPr>
                           <w:keepNext/>
                           <w:keepLines/>
-                          <w:spacing w:beforeLines="50" w:after="80" w:line="240" w:lineRule="auto"/>
+                          <w:spacing w:beforeLines="50" w:after="40" w:line="240" w:lineRule="auto"/>
                           <w:jc w:val="left"/>
                           <w:rPr>
                             <w:rFonts w:hint="default" w:ascii="Times New Roman" w:hAnsi="Times New Roman" w:eastAsia="宋体" w:cs="Times New Roman"/>
@@ -4026,9 +4072,9 @@
                         <w:insideV w:val="single" w:color="D9D9D9" w:sz="2" w:space="0"/>
                       </w:tblBorders>
                       <w:tblCellMar>
-                        <w:top w:w="100" w:type="dxa"/>
+                        <w:top w:w="60" w:type="dxa"/>
                         <w:left w:w="100" w:type="dxa"/>
-                        <w:bottom w:w="100" w:type="dxa"/>
+                        <w:bottom w:w="60" w:type="dxa"/>
                         <w:right w:w="100" w:type="dxa"/>
                       </w:tblCellMar>
                     </w:tblPrEx>
@@ -4049,7 +4095,7 @@
                         <w:pPr>
                           <w:keepNext/>
                           <w:keepLines/>
-                          <w:spacing w:beforeLines="50" w:after="80" w:line="240" w:lineRule="auto"/>
+                          <w:spacing w:beforeLines="50" w:after="40" w:line="240" w:lineRule="auto"/>
                           <w:jc w:val="left"/>
                           <w:rPr>
                             <w:rFonts w:hint="default" w:ascii="Times New Roman" w:hAnsi="Times New Roman" w:eastAsia="宋体" w:cs="Times New Roman"/>
@@ -4087,7 +4133,7 @@
                         <w:pPr>
                           <w:keepNext/>
                           <w:keepLines/>
-                          <w:spacing w:beforeLines="50" w:after="80" w:line="240" w:lineRule="auto"/>
+                          <w:spacing w:beforeLines="50" w:after="40" w:line="240" w:lineRule="auto"/>
                           <w:jc w:val="left"/>
                           <w:rPr>
                             <w:rFonts w:hint="default" w:ascii="Times New Roman" w:hAnsi="Times New Roman" w:eastAsia="宋体" w:cs="Times New Roman"/>
@@ -4125,7 +4171,7 @@
                         <w:pPr>
                           <w:keepNext/>
                           <w:keepLines/>
-                          <w:spacing w:beforeLines="50" w:after="80" w:line="240" w:lineRule="auto"/>
+                          <w:spacing w:beforeLines="50" w:after="40" w:line="240" w:lineRule="auto"/>
                           <w:jc w:val="left"/>
                           <w:rPr>
                             <w:rFonts w:hint="default" w:ascii="Times New Roman" w:hAnsi="Times New Roman" w:eastAsia="宋体" w:cs="Times New Roman"/>
@@ -4161,9 +4207,9 @@
                         <w:insideV w:val="single" w:color="D9D9D9" w:sz="2" w:space="0"/>
                       </w:tblBorders>
                       <w:tblCellMar>
-                        <w:top w:w="100" w:type="dxa"/>
+                        <w:top w:w="60" w:type="dxa"/>
                         <w:left w:w="100" w:type="dxa"/>
-                        <w:bottom w:w="100" w:type="dxa"/>
+                        <w:bottom w:w="60" w:type="dxa"/>
                         <w:right w:w="100" w:type="dxa"/>
                       </w:tblCellMar>
                     </w:tblPrEx>
@@ -4184,7 +4230,7 @@
                         <w:pPr>
                           <w:keepNext/>
                           <w:keepLines/>
-                          <w:spacing w:beforeLines="50" w:after="80" w:line="240" w:lineRule="auto"/>
+                          <w:spacing w:beforeLines="50" w:after="40" w:line="240" w:lineRule="auto"/>
                           <w:jc w:val="left"/>
                           <w:rPr>
                             <w:rFonts w:hint="default" w:ascii="Times New Roman" w:hAnsi="Times New Roman" w:eastAsia="宋体" w:cs="Times New Roman"/>
@@ -4222,7 +4268,7 @@
                         <w:pPr>
                           <w:keepNext/>
                           <w:keepLines/>
-                          <w:spacing w:beforeLines="50" w:after="80" w:line="240" w:lineRule="auto"/>
+                          <w:spacing w:beforeLines="50" w:after="40" w:line="240" w:lineRule="auto"/>
                           <w:jc w:val="left"/>
                           <w:rPr>
                             <w:rFonts w:hint="default" w:ascii="Times New Roman" w:hAnsi="Times New Roman" w:eastAsia="宋体" w:cs="Times New Roman"/>
@@ -4260,7 +4306,7 @@
                         <w:pPr>
                           <w:keepNext/>
                           <w:keepLines/>
-                          <w:spacing w:beforeLines="50" w:after="80" w:line="240" w:lineRule="auto"/>
+                          <w:spacing w:beforeLines="50" w:after="40" w:line="240" w:lineRule="auto"/>
                           <w:jc w:val="left"/>
                           <w:rPr>
                             <w:rFonts w:hint="default" w:ascii="Times New Roman" w:hAnsi="Times New Roman" w:eastAsia="宋体" w:cs="Times New Roman"/>
@@ -4296,9 +4342,9 @@
                         <w:insideV w:val="single" w:color="D9D9D9" w:sz="2" w:space="0"/>
                       </w:tblBorders>
                       <w:tblCellMar>
-                        <w:top w:w="100" w:type="dxa"/>
+                        <w:top w:w="60" w:type="dxa"/>
                         <w:left w:w="100" w:type="dxa"/>
-                        <w:bottom w:w="100" w:type="dxa"/>
+                        <w:bottom w:w="60" w:type="dxa"/>
                         <w:right w:w="100" w:type="dxa"/>
                       </w:tblCellMar>
                     </w:tblPrEx>
@@ -4319,7 +4365,7 @@
                         <w:pPr>
                           <w:keepNext/>
                           <w:keepLines/>
-                          <w:spacing w:beforeLines="50" w:after="80" w:line="240" w:lineRule="auto"/>
+                          <w:spacing w:beforeLines="50" w:after="40" w:line="240" w:lineRule="auto"/>
                           <w:jc w:val="left"/>
                           <w:rPr>
                             <w:rFonts w:hint="default" w:ascii="Times New Roman" w:hAnsi="Times New Roman" w:eastAsia="宋体" w:cs="Times New Roman"/>
@@ -4357,7 +4403,7 @@
                         <w:pPr>
                           <w:keepNext/>
                           <w:keepLines/>
-                          <w:spacing w:beforeLines="50" w:after="80" w:line="240" w:lineRule="auto"/>
+                          <w:spacing w:beforeLines="50" w:after="40" w:line="240" w:lineRule="auto"/>
                           <w:jc w:val="left"/>
                           <w:rPr>
                             <w:rFonts w:hint="default" w:ascii="Times New Roman" w:hAnsi="Times New Roman" w:eastAsia="宋体" w:cs="Times New Roman"/>
@@ -4395,7 +4441,7 @@
                         <w:pPr>
                           <w:keepNext/>
                           <w:keepLines/>
-                          <w:spacing w:beforeLines="50" w:after="80" w:line="240" w:lineRule="auto"/>
+                          <w:spacing w:beforeLines="50" w:after="40" w:line="240" w:lineRule="auto"/>
                           <w:jc w:val="left"/>
                           <w:rPr>
                             <w:rFonts w:hint="default" w:ascii="Times New Roman" w:hAnsi="Times New Roman" w:eastAsia="宋体" w:cs="Times New Roman"/>
@@ -4431,9 +4477,9 @@
                         <w:insideV w:val="single" w:color="D9D9D9" w:sz="2" w:space="0"/>
                       </w:tblBorders>
                       <w:tblCellMar>
-                        <w:top w:w="100" w:type="dxa"/>
+                        <w:top w:w="60" w:type="dxa"/>
                         <w:left w:w="100" w:type="dxa"/>
-                        <w:bottom w:w="100" w:type="dxa"/>
+                        <w:bottom w:w="60" w:type="dxa"/>
                         <w:right w:w="100" w:type="dxa"/>
                       </w:tblCellMar>
                     </w:tblPrEx>
@@ -4454,7 +4500,7 @@
                         <w:pPr>
                           <w:keepNext/>
                           <w:keepLines/>
-                          <w:spacing w:beforeLines="50" w:after="80" w:line="240" w:lineRule="auto"/>
+                          <w:spacing w:beforeLines="50" w:after="40" w:line="240" w:lineRule="auto"/>
                           <w:jc w:val="left"/>
                           <w:rPr>
                             <w:rFonts w:hint="default" w:ascii="Times New Roman" w:hAnsi="Times New Roman" w:eastAsia="宋体" w:cs="Times New Roman"/>
@@ -4492,7 +4538,7 @@
                         <w:pPr>
                           <w:keepNext/>
                           <w:keepLines/>
-                          <w:spacing w:beforeLines="50" w:after="80" w:line="240" w:lineRule="auto"/>
+                          <w:spacing w:beforeLines="50" w:after="40" w:line="240" w:lineRule="auto"/>
                           <w:jc w:val="left"/>
                           <w:rPr>
                             <w:rFonts w:hint="default" w:ascii="Times New Roman" w:hAnsi="Times New Roman" w:eastAsia="宋体" w:cs="Times New Roman"/>
@@ -4530,7 +4576,7 @@
                         <w:pPr>
                           <w:keepNext/>
                           <w:keepLines/>
-                          <w:spacing w:beforeLines="50" w:after="80" w:line="240" w:lineRule="auto"/>
+                          <w:spacing w:beforeLines="50" w:after="40" w:line="240" w:lineRule="auto"/>
                           <w:jc w:val="left"/>
                           <w:rPr>
                             <w:rFonts w:hint="default" w:ascii="Times New Roman" w:hAnsi="Times New Roman" w:eastAsia="宋体" w:cs="Times New Roman"/>
@@ -4566,9 +4612,9 @@
                         <w:insideV w:val="single" w:color="D9D9D9" w:sz="2" w:space="0"/>
                       </w:tblBorders>
                       <w:tblCellMar>
-                        <w:top w:w="100" w:type="dxa"/>
+                        <w:top w:w="60" w:type="dxa"/>
                         <w:left w:w="100" w:type="dxa"/>
-                        <w:bottom w:w="100" w:type="dxa"/>
+                        <w:bottom w:w="60" w:type="dxa"/>
                         <w:right w:w="100" w:type="dxa"/>
                       </w:tblCellMar>
                     </w:tblPrEx>
@@ -4589,7 +4635,7 @@
                         <w:pPr>
                           <w:keepNext w:val="0"/>
                           <w:keepLines/>
-                          <w:spacing w:beforeLines="50" w:after="80" w:line="240" w:lineRule="auto"/>
+                          <w:spacing w:beforeLines="50" w:after="40" w:line="240" w:lineRule="auto"/>
                           <w:jc w:val="left"/>
                           <w:rPr>
                             <w:rFonts w:hint="default" w:ascii="Times New Roman" w:hAnsi="Times New Roman" w:eastAsia="宋体" w:cs="Times New Roman"/>
@@ -4627,7 +4673,7 @@
                         <w:pPr>
                           <w:keepNext w:val="0"/>
                           <w:keepLines/>
-                          <w:spacing w:beforeLines="50" w:after="80" w:line="240" w:lineRule="auto"/>
+                          <w:spacing w:beforeLines="50" w:after="40" w:line="240" w:lineRule="auto"/>
                           <w:jc w:val="left"/>
                           <w:rPr>
                             <w:rFonts w:hint="default" w:ascii="Times New Roman" w:hAnsi="Times New Roman" w:eastAsia="宋体" w:cs="Times New Roman"/>
@@ -4665,7 +4711,7 @@
                         <w:pPr>
                           <w:keepNext w:val="0"/>
                           <w:keepLines/>
-                          <w:spacing w:beforeLines="50" w:after="80" w:line="240" w:lineRule="auto"/>
+                          <w:spacing w:beforeLines="50" w:after="40" w:line="240" w:lineRule="auto"/>
                           <w:jc w:val="left"/>
                           <w:rPr>
                             <w:rFonts w:hint="default" w:ascii="Times New Roman" w:hAnsi="Times New Roman" w:eastAsia="宋体" w:cs="Times New Roman"/>
@@ -4766,7 +4812,144 @@
                 <w:szCs w:val="28"/>
                 <w:lang w:val="en-US" w:eastAsia="zh-CN"/>
               </w:rPr>
-              <w:t>采集程序按启动恢复、定时采样、质量检查、窗口对齐、状态关联和日志追加执行，见图5。量程外、缺测和明显非物理读数输出无效原因；状态未知或切换等待期间继续保存原始记录，暂缓单一故障原因判断。质量筛选条件、等待时间和健康参照编号均写入配置，后续评价同时报告被暂缓判断的时间比例及该时段发生的异常。</w:t>
+              <w:t>采集程序按启动恢复、定时采样、质量检查、窗口对齐、状态关联和日志追加执行，质量及状态分支与诊断统一见图6。量程外、缺测和明显非物理读数输出无效原因；状态未知或切换等待期间继续保存原始记录，暂缓单一故障原因判断。质量筛选条件、等待时间和健康参照编号均写入配置，后续评价同时报告被暂缓判断的时间比例及该时段发生的异常。</w:t>
+            </w:r>
+          </w:p>
+          <w:p>
+            <w:pPr>
+              <w:keepNext/>
+              <w:keepLines/>
+              <w:spacing w:before="140" w:beforeLines="50" w:after="100" w:line="240" w:lineRule="auto"/>
+              <w:jc w:val="left"/>
+              <w:rPr>
+                <w:rFonts w:hint="default" w:ascii="Times New Roman" w:hAnsi="Times New Roman" w:eastAsia="宋体" w:cs="Times New Roman"/>
+                <w:b w:val="0"/>
+                <w:sz w:val="21"/>
+                <w:szCs w:val="28"/>
+                <w:lang w:val="en-US" w:eastAsia="zh-CN"/>
+              </w:rPr>
+            </w:pPr>
+            <w:r>
+              <w:rPr>
+                <w:rFonts w:hint="default" w:ascii="Times New Roman" w:hAnsi="Times New Roman" w:eastAsia="宋体" w:cs="Times New Roman"/>
+                <w:b/>
+                <w:sz w:val="21"/>
+                <w:szCs w:val="28"/>
+                <w:lang w:val="en-US" w:eastAsia="zh-CN"/>
+              </w:rPr>
+              <w:t>2.3 标定与等效模型</w:t>
+            </w:r>
+            <w:r>
+              <w:rPr>
+                <w:rFonts w:hint="default" w:ascii="Times New Roman" w:hAnsi="Times New Roman" w:eastAsia="宋体" w:cs="Times New Roman"/>
+                <w:b w:val="0"/>
+                <w:sz w:val="21"/>
+                <w:szCs w:val="28"/>
+                <w:lang w:val="en-US" w:eastAsia="zh-CN"/>
+              </w:rPr>
+              <w:br w:type="textWrapping"/>
+            </w:r>
+            <w:r>
+              <w:rPr>
+                <w:rFonts w:hint="default" w:ascii="Times New Roman" w:hAnsi="Times New Roman" w:eastAsia="宋体" w:cs="Times New Roman"/>
+                <w:b w:val="0"/>
+                <w:sz w:val="21"/>
+                <w:szCs w:val="28"/>
+                <w:lang w:val="en-US" w:eastAsia="zh-CN"/>
+              </w:rPr>
+              <w:t>压力采用参考表进行多点校核，流量采用容积或称重计时形成独立参照，记录零点、重复性、有效量程及同步误差。双压力的收益取决于健康压降是否大于差压不确定度；压差小于测量误差时，先调整量程、布点或试验程度，再进入辨识研究。</w:t>
+            </w:r>
+          </w:p>
+          <w:p>
+            <w:pPr>
+              <w:keepNext w:val="0"/>
+              <w:keepLines/>
+              <w:spacing w:beforeLines="50" w:after="100" w:line="240" w:lineRule="auto"/>
+              <w:jc w:val="left"/>
+              <w:rPr>
+                <w:rFonts w:hint="default" w:ascii="Times New Roman" w:hAnsi="Times New Roman" w:eastAsia="宋体" w:cs="Times New Roman"/>
+                <w:sz w:val="21"/>
+                <w:szCs w:val="28"/>
+                <w:lang w:val="en-US" w:eastAsia="zh-CN"/>
+              </w:rPr>
+            </w:pPr>
+            <w:r>
+              <w:rPr>
+                <w:rFonts w:hint="default" w:ascii="Times New Roman" w:hAnsi="Times New Roman" w:eastAsia="宋体" w:cs="Times New Roman"/>
+                <w:sz w:val="21"/>
+                <w:szCs w:val="28"/>
+                <w:lang w:val="en-US" w:eastAsia="zh-CN"/>
+              </w:rPr>
+              <w:t>借鉴丁法龙等“建模—测压测流校核”的论证方式[2]，对图2区段采用P0−P1=R·Q²、Q=(Cₙ+Cₗ)·√P1，共同供水阻力连接A、B支路。R增加模拟受限，Cₗ增加模拟泄漏；未知正常负载Cₙ增加也可能产生同样观测。模型假定非压力补偿负载、理想同步和单故障，仅用于测点筛选、量程核对与反例分析，参数尚未实物标定。P用kPa、Q用L/min，R及C单位分别为kPa/(L/min)²、(L/min)/√kPa。</w:t>
+            </w:r>
+          </w:p>
+          <w:p>
+            <w:pPr>
+              <w:keepNext w:val="0"/>
+              <w:keepLines/>
+              <w:spacing w:beforeLines="50" w:after="100" w:line="240" w:lineRule="auto"/>
+              <w:jc w:val="left"/>
+              <w:rPr>
+                <w:rFonts w:hint="default" w:ascii="Times New Roman" w:hAnsi="Times New Roman" w:eastAsia="宋体" w:cs="Times New Roman"/>
+                <w:sz w:val="21"/>
+                <w:szCs w:val="28"/>
+                <w:lang w:val="en-US" w:eastAsia="zh-CN"/>
+              </w:rPr>
+            </w:pPr>
+            <w:r>
+              <w:rPr>
+                <w:rFonts w:hint="default" w:ascii="Times New Roman" w:hAnsi="Times New Roman" w:eastAsia="宋体" w:cs="Times New Roman"/>
+                <w:sz w:val="21"/>
+                <w:szCs w:val="28"/>
+                <w:lang w:val="en-US" w:eastAsia="zh-CN"/>
+              </w:rPr>
+              <w:t>预实验在多档健康供压和B状态下测定压力—流量关系，检验残差与重复性，再冻结健康参照及适用范围。流量计、接头和阀门压损计入测量，不沿用理想系数。负载为压力补偿型或实测不符合平方律时，修订模型及特征；本期不代替CFD、水锤或完整管网标定。</w:t>
+            </w:r>
+          </w:p>
+          <w:p>
+            <w:pPr>
+              <w:keepNext w:val="0"/>
+              <w:keepLines/>
+              <w:spacing w:beforeLines="50" w:after="100" w:line="240" w:lineRule="auto"/>
+              <w:jc w:val="left"/>
+              <w:rPr>
+                <w:rFonts w:hint="default" w:ascii="Times New Roman" w:hAnsi="Times New Roman" w:eastAsia="宋体" w:cs="Times New Roman"/>
+                <w:sz w:val="21"/>
+                <w:szCs w:val="28"/>
+                <w:lang w:val="en-US" w:eastAsia="zh-CN"/>
+              </w:rPr>
+            </w:pPr>
+            <w:r>
+              <w:rPr>
+                <w:rFonts w:hint="default" w:ascii="Times New Roman" w:hAnsi="Times New Roman" w:eastAsia="宋体" w:cs="Times New Roman"/>
+                <w:sz w:val="21"/>
+                <w:szCs w:val="28"/>
+                <w:lang w:val="en-US" w:eastAsia="zh-CN"/>
+              </w:rPr>
+              <w:t>据候选目录，200kPa、±0.25%FS压力通道单项界限为±0.5kPa，两通道差分最不利界限为1kPa，完整采集误差还须计入调理、ADC、温漂及参考条件。大量程1.6MPa、0.5—1%FS方案单通道界限达8—16kPa，不适合直接承担本项目主要差压测量。1秒流量窗的一个脉冲对应0.111L/min，10秒窗对应0.0111L/min；分辨率和窗口延迟必须同时权衡。</w:t>
+            </w:r>
+          </w:p>
+          <w:p>
+            <w:pPr>
+              <w:keepNext w:val="0"/>
+              <w:keepLines/>
+              <w:spacing w:beforeLines="50" w:after="100" w:line="240" w:lineRule="auto"/>
+              <w:jc w:val="left"/>
+              <w:rPr>
+                <w:rFonts w:hint="default" w:ascii="Times New Roman" w:hAnsi="Times New Roman" w:eastAsia="宋体" w:cs="Times New Roman"/>
+                <w:sz w:val="21"/>
+                <w:szCs w:val="28"/>
+                <w:lang w:val="en-US" w:eastAsia="zh-CN"/>
+              </w:rPr>
+            </w:pPr>
+            <w:r>
+              <w:rPr>
+                <w:rFonts w:hint="default" w:ascii="Times New Roman" w:hAnsi="Times New Roman" w:eastAsia="宋体" w:cs="Times New Roman"/>
+                <w:sz w:val="21"/>
+                <w:szCs w:val="28"/>
+                <w:lang w:val="en-US" w:eastAsia="zh-CN"/>
+              </w:rPr>
+              <w:t>另以C=0.28作为台架健康设计负载，C至0.37、R为0.8或8.0，结合三档供压及B开关做24组模型边界计算，A流量为1.85—4.34L/min，落在候选流量计范围内，如图5。原480次合成试验仍保留原参数，不能用此计算代替实测。模型最大总流量约7.95L/min；水源需按流量—压力工作曲线核定，不能将商品开口流量与截止压力合并为工作点。基础预算以借用可调连续水源为前提，落实前不宣称已经具备台架。</w:t>
             </w:r>
           </w:p>
           <w:p>
@@ -4790,11 +4973,11 @@
                 <w:lang w:val="en-US" w:eastAsia="zh-CN"/>
               </w:rPr>
               <w:pict>
-                <v:shape id="_x0000_i1030" o:spt="75" alt="图5 采集与质量状态处理流程 拟实施" type="#_x0000_t75" style="height:385.05pt;width:425pt;" filled="f" o:preferrelative="t" stroked="f" coordsize="21600,21600">
+                <v:shape id="_x0000_i1030" o:spt="75" alt="图5 候选量程与测量界限的模型核对 非实测" type="#_x0000_t75" style="height:417.2pt;width:425pt;" filled="f" o:preferrelative="t" stroked="f" coordsize="21600,21600">
                   <v:path/>
                   <v:fill on="f" focussize="0,0"/>
                   <v:stroke on="f"/>
-                  <v:imagedata r:id="rId10" o:title="acquisition_flow"/>
+                  <v:imagedata r:id="rId10" o:title="hardware_feasibility"/>
                   <o:lock v:ext="edit" aspectratio="t"/>
                   <w10:wrap type="none"/>
                   <w10:anchorlock/>
@@ -4817,54 +5000,91 @@
                 <w:szCs w:val="28"/>
                 <w:lang w:val="en-US" w:eastAsia="zh-CN"/>
               </w:rPr>
-              <w:t>图5 采集与质量状态处理流程 拟实施</w:t>
-            </w:r>
-          </w:p>
-          <w:p>
-            <w:pPr>
-              <w:keepNext/>
-              <w:keepLines/>
-              <w:spacing w:before="140" w:beforeLines="50" w:after="100" w:line="240" w:lineRule="auto"/>
-              <w:jc w:val="left"/>
-              <w:rPr>
-                <w:rFonts w:hint="default" w:ascii="Times New Roman" w:hAnsi="Times New Roman" w:eastAsia="宋体" w:cs="Times New Roman"/>
-                <w:b w:val="0"/>
-                <w:sz w:val="21"/>
-                <w:szCs w:val="28"/>
-                <w:lang w:val="en-US" w:eastAsia="zh-CN"/>
-              </w:rPr>
-            </w:pPr>
-            <w:r>
-              <w:rPr>
-                <w:rFonts w:hint="default" w:ascii="Times New Roman" w:hAnsi="Times New Roman" w:eastAsia="宋体" w:cs="Times New Roman"/>
-                <w:b/>
-                <w:sz w:val="21"/>
-                <w:szCs w:val="28"/>
-                <w:lang w:val="en-US" w:eastAsia="zh-CN"/>
-              </w:rPr>
-              <w:t>2.3 标定与等效模型</w:t>
-            </w:r>
-            <w:r>
-              <w:rPr>
-                <w:rFonts w:hint="default" w:ascii="Times New Roman" w:hAnsi="Times New Roman" w:eastAsia="宋体" w:cs="Times New Roman"/>
-                <w:b w:val="0"/>
-                <w:sz w:val="21"/>
-                <w:szCs w:val="28"/>
-                <w:lang w:val="en-US" w:eastAsia="zh-CN"/>
-              </w:rPr>
-              <w:br w:type="textWrapping"/>
-            </w:r>
-            <w:r>
-              <w:rPr>
-                <w:rFonts w:hint="default" w:ascii="Times New Roman" w:hAnsi="Times New Roman" w:eastAsia="宋体" w:cs="Times New Roman"/>
-                <w:b w:val="0"/>
-                <w:sz w:val="21"/>
-                <w:szCs w:val="28"/>
-                <w:lang w:val="en-US" w:eastAsia="zh-CN"/>
-              </w:rPr>
-              <w:t>压力采用参考表进行多点校核，流量采用容积或称重计时形成独立参照，记录零点、重复性、有效量程及同步误差。双压力的收益取决于健康压降是否大于差压不确定度；压差小于测量误差时，先调整量程、布点或试验程度，再进入辨识研究。</w:t>
-            </w:r>
-          </w:p>
+              <w:t>图5 候选量程与测量界限的模型核对 非实测</w:t>
+            </w:r>
+          </w:p>
+          <w:tbl>
+            <w:tblPr>
+              <w:tblStyle w:val="6"/>
+              <w:tblW w:w="9100" w:type="dxa"/>
+              <w:tblInd w:w="5" w:type="dxa"/>
+              <w:tblBorders>
+                <w:top w:val="none" w:color="auto" w:sz="0" w:space="0"/>
+                <w:left w:val="none" w:color="auto" w:sz="0" w:space="0"/>
+                <w:bottom w:val="none" w:color="auto" w:sz="0" w:space="0"/>
+                <w:right w:val="none" w:color="auto" w:sz="0" w:space="0"/>
+                <w:insideH w:val="none" w:color="auto" w:sz="0" w:space="0"/>
+                <w:insideV w:val="none" w:color="auto" w:sz="0" w:space="0"/>
+              </w:tblBorders>
+              <w:tblLayout w:type="fixed"/>
+              <w:tblCellMar>
+                <w:top w:w="0" w:type="dxa"/>
+                <w:left w:w="0" w:type="dxa"/>
+                <w:bottom w:w="0" w:type="dxa"/>
+                <w:right w:w="0" w:type="dxa"/>
+              </w:tblCellMar>
+            </w:tblPr>
+            <w:tblGrid>
+              <w:gridCol w:w="9100"/>
+            </w:tblGrid>
+            <w:tr>
+              <w:tblPrEx>
+                <w:tblBorders>
+                  <w:top w:val="none" w:color="auto" w:sz="0" w:space="0"/>
+                  <w:left w:val="none" w:color="auto" w:sz="0" w:space="0"/>
+                  <w:bottom w:val="none" w:color="auto" w:sz="0" w:space="0"/>
+                  <w:right w:val="none" w:color="auto" w:sz="0" w:space="0"/>
+                  <w:insideH w:val="none" w:color="auto" w:sz="0" w:space="0"/>
+                  <w:insideV w:val="none" w:color="auto" w:sz="0" w:space="0"/>
+                </w:tblBorders>
+                <w:tblCellMar>
+                  <w:top w:w="0" w:type="dxa"/>
+                  <w:left w:w="0" w:type="dxa"/>
+                  <w:bottom w:w="0" w:type="dxa"/>
+                  <w:right w:w="0" w:type="dxa"/>
+                </w:tblCellMar>
+              </w:tblPrEx>
+              <w:trPr>
+                <w:cantSplit/>
+              </w:trPr>
+              <w:tc>
+                <w:tcPr>
+                  <w:tcW w:w="9100" w:type="dxa"/>
+                  <w:tcBorders>
+                    <w:tl2br w:val="nil"/>
+                    <w:tr2bl w:val="nil"/>
+                  </w:tcBorders>
+                </w:tcPr>
+                <w:p>
+                  <w:pPr>
+                    <w:keepNext w:val="0"/>
+                    <w:keepLines/>
+                    <w:pageBreakBefore w:val="0"/>
+                    <w:spacing w:beforeLines="50" w:after="100" w:line="240" w:lineRule="auto"/>
+                    <w:jc w:val="left"/>
+                    <w:rPr>
+                      <w:rFonts w:hint="default" w:ascii="Times New Roman" w:hAnsi="Times New Roman" w:eastAsia="宋体" w:cs="Times New Roman"/>
+                      <w:sz w:val="21"/>
+                      <w:szCs w:val="28"/>
+                      <w:vertAlign w:val="baseline"/>
+                      <w:lang w:val="en-US" w:eastAsia="zh-CN"/>
+                    </w:rPr>
+                  </w:pPr>
+                  <w:r>
+                    <w:rPr>
+                      <w:rFonts w:hint="default" w:ascii="Times New Roman" w:hAnsi="Times New Roman" w:eastAsia="宋体" w:cs="Times New Roman"/>
+                      <w:b w:val="0"/>
+                      <w:sz w:val="21"/>
+                      <w:szCs w:val="28"/>
+                      <w:vertAlign w:val="baseline"/>
+                      <w:lang w:val="en-US" w:eastAsia="zh-CN"/>
+                    </w:rPr>
+                    <w:t>另检查两故障、三供压、B开关及三程度共36组目标，修正受限范围后均可在模型内达到。仅按压力标称界限、10秒计数量化及流量±1%读数分析，健康与故障特征区间分离；若保守按5L/min满量程的1%分析，80kPa下两个5%泄漏组合区间重叠，弱异常不保证可分。流量精度定义须进一步核对，温漂、ADC、调理及安装误差尚未计入，不能转成实物检出率。</w:t>
+                  </w:r>
+                </w:p>
+              </w:tc>
+            </w:tr>
+          </w:tbl>
           <w:p>
             <w:pPr>
               <w:keepNext w:val="0"/>
@@ -4878,14 +5098,51 @@
                 <w:lang w:val="en-US" w:eastAsia="zh-CN"/>
               </w:rPr>
             </w:pPr>
-            <w:r>
-              <w:rPr>
-                <w:rFonts w:hint="default" w:ascii="Times New Roman" w:hAnsi="Times New Roman" w:eastAsia="宋体" w:cs="Times New Roman"/>
-                <w:sz w:val="21"/>
-                <w:szCs w:val="28"/>
-                <w:lang w:val="en-US" w:eastAsia="zh-CN"/>
-              </w:rPr>
-              <w:t>当前等效模型采用P0−P1=R·Q²、Q=C·√P1，共同供水阻力连接A、B支路。图6将A负载系数写为正常负载Cₙ与泄漏负载Cₗ之和，用于说明流量计为何应覆盖两条下游路径，以及未知正常负载为何可能与泄漏同形。局部R增加模拟受限，Cₗ增加模拟泄漏。该集中平方律模型采用非压力补偿负载、理想同步与单故障假设，用于测点筛选、量程核对和反例分析，参数尚未通过实物标定。</w:t>
+          </w:p>
+          <w:p>
+            <w:pPr>
+              <w:keepNext/>
+              <w:keepLines/>
+              <w:pageBreakBefore/>
+              <w:spacing w:before="140" w:beforeLines="50" w:after="100" w:line="240" w:lineRule="auto"/>
+              <w:jc w:val="left"/>
+              <w:rPr>
+                <w:rFonts w:hint="default" w:ascii="Times New Roman" w:hAnsi="Times New Roman" w:eastAsia="宋体" w:cs="Times New Roman"/>
+                <w:b w:val="0"/>
+                <w:sz w:val="21"/>
+                <w:szCs w:val="28"/>
+                <w:lang w:val="en-US" w:eastAsia="zh-CN"/>
+              </w:rPr>
+            </w:pPr>
+            <w:r>
+              <w:rPr>
+                <w:rFonts w:hint="default" w:ascii="Times New Roman" w:hAnsi="Times New Roman" w:eastAsia="宋体" w:cs="Times New Roman"/>
+                <w:b/>
+                <w:sz w:val="21"/>
+                <w:szCs w:val="28"/>
+                <w:lang w:val="en-US" w:eastAsia="zh-CN"/>
+              </w:rPr>
+              <w:t>3 渐进故障诊断与早期评价</w:t>
+            </w:r>
+            <w:r>
+              <w:rPr>
+                <w:rFonts w:hint="default" w:ascii="Times New Roman" w:hAnsi="Times New Roman" w:eastAsia="宋体" w:cs="Times New Roman"/>
+                <w:b w:val="0"/>
+                <w:sz w:val="21"/>
+                <w:szCs w:val="28"/>
+                <w:lang w:val="en-US" w:eastAsia="zh-CN"/>
+              </w:rPr>
+              <w:br w:type="textWrapping"/>
+            </w:r>
+            <w:r>
+              <w:rPr>
+                <w:rFonts w:hint="default" w:ascii="Times New Roman" w:hAnsi="Times New Roman" w:eastAsia="宋体" w:cs="Times New Roman"/>
+                <w:b w:val="0"/>
+                <w:sz w:val="21"/>
+                <w:szCs w:val="28"/>
+                <w:lang w:val="en-US" w:eastAsia="zh-CN"/>
+              </w:rPr>
+              <w:t>拟采用压力归一化流量K=Q/√P1和区段阻力估计R̂=(P0−P1)/Q²，分别描述下游等效负载及监测区段的阻力变化。程序在测量有效、P1与Q高于误差下限且运行状态明确后，比较同工况健康特征及误差区间，再检验偏离是否持续，处理分支见图6。健康参照、偏离阈值和持续条件由标定小试确定并在验证前冻结；故障期间不以自动更新参照消除异常。切换等待段仍保留原始数据，单独报告暂缓判断的时间、误报和漏检。</w:t>
             </w:r>
           </w:p>
           <w:p>
@@ -4909,11 +5166,11 @@
                 <w:lang w:val="en-US" w:eastAsia="zh-CN"/>
               </w:rPr>
               <w:pict>
-                <v:shape id="_x0000_i1031" o:spt="75" alt="图6 双支路水力等效模型与特征关系 参数未标定" type="#_x0000_t75" style="height:299pt;width:425pt;" filled="f" o:preferrelative="t" stroked="f" coordsize="21600,21600">
+                <v:shape id="_x0000_i1031" o:spt="75" alt="图6 状态辅助与有限故障模式诊断流程设计" type="#_x0000_t75" style="height:294.45pt;width:425pt;" filled="f" o:preferrelative="t" stroked="f" coordsize="21600,21600">
                   <v:path/>
                   <v:fill on="f" focussize="0,0"/>
                   <v:stroke on="f"/>
-                  <v:imagedata r:id="rId11" o:title="hydraulic_model"/>
+                  <v:imagedata r:id="rId11" o:title="diagnosis_flow"/>
                   <o:lock v:ext="edit" aspectratio="t"/>
                   <w10:wrap type="none"/>
                   <w10:anchorlock/>
@@ -4936,7 +5193,7 @@
                 <w:szCs w:val="28"/>
                 <w:lang w:val="en-US" w:eastAsia="zh-CN"/>
               </w:rPr>
-              <w:t>图6 双支路水力等效模型与特征关系 参数未标定</w:t>
+              <w:t>图6 状态辅助与有限故障模式诊断流程设计</w:t>
             </w:r>
           </w:p>
           <w:p>
@@ -4959,7 +5216,7 @@
                 <w:szCs w:val="28"/>
                 <w:lang w:val="en-US" w:eastAsia="zh-CN"/>
               </w:rPr>
-              <w:t>预实验拟先在多个健康供压和B状态下测定压力与流量关系，检验平方律近似的残差及重复性，再确定健康参照和适用范围。流量计、接头及调节阀的实际压损纳入测量，安装后不能直接沿用理想模型系数。若负载为压力补偿型或稳定数据明显不符合当前关系，应修订模型并重新核对特征；本期不以该模型替代CFD、水锤分析或完整滴灌管网标定。</w:t>
+              <w:t>输出分为等效泄漏模式、等效受限模式、异常待检查和数据无效。未知正常负载可能与泄漏同形，压力差分偏置可能与受限混淆；这类条件下保留异常证据并提示核查，不强制给出单一原因。定位精度限于被监测支管或压力点包围区段。</w:t>
             </w:r>
           </w:p>
           <w:p>
@@ -4982,7 +5239,7 @@
                 <w:szCs w:val="28"/>
                 <w:lang w:val="en-US" w:eastAsia="zh-CN"/>
               </w:rPr>
-              <w:t>据候选目录，200kPa、±0.25%FS压力通道单项界限为±0.5kPa，两通道差分最不利界限为1kPa，完整采集误差还须计入调理、ADC、温漂及参考条件。大量程1.6MPa、0.5—1%FS方案单通道界限达8—16kPa，不适合直接承担本项目主要差压测量。1秒流量窗的一个脉冲对应0.111L/min，10秒窗对应0.0111L/min；分辨率和窗口延迟必须同时权衡。</w:t>
+              <w:t>模式提示附带P0/P1/Q、特征偏离、阀态、质量标志及参照编号。K增大而区段阻力稳定时检查等效泄漏或负载变化；区段阻力增大时检查等效受限，同时核查压力偏置。两个特征同时变化、状态不明或证据不足时，提示异常待检查。管理者据此确定核查顺序，真实原因最终以独立操作记录、参考测量及现场检查为依据。</w:t>
             </w:r>
           </w:p>
           <w:p>
@@ -5005,8 +5262,128 @@
                 <w:szCs w:val="28"/>
                 <w:lang w:val="en-US" w:eastAsia="zh-CN"/>
               </w:rPr>
-              <w:t>另以C=0.28作为台架健康设计负载，C至0.37、R为0.8或8.0，结合三档供压及B开关做24组模型边界计算，A流量为1.85—4.34L/min，落在候选流量计范围内，如图7。原480次合成试验仍保留原参数，不能用此计算代替实测。模型最大总流量约7.95L/min；水源需按流量—压力工作曲线核定，不能将商品开口流量与截止压力合并为工作点。基础预算以借用可调连续水源为前提，落实前不宣称已经具备台架。</w:t>
-            </w:r>
+              <w:t>早期评价以独立参考测量确定的预设失效判据为终点，同时记录故障操作起点、本地首次可靠提示和远端首次接收。考察相对同工况健康流量偏离5%、10%、15%的暂定程度，绘制检出、误报及提前量随程度变化的关系。15%目前是模型演示参照，实际程度与失效判据由导师结合预实验审核后冻结。研究目标是找出可测、可判、可提前的条件及失败边界，性能阈值由有独立标签的小试确定。</w:t>
+            </w:r>
+          </w:p>
+          <w:tbl>
+            <w:tblPr>
+              <w:tblStyle w:val="6"/>
+              <w:tblW w:w="9100" w:type="dxa"/>
+              <w:tblInd w:w="5" w:type="dxa"/>
+              <w:tblBorders>
+                <w:top w:val="none" w:color="auto" w:sz="0" w:space="0"/>
+                <w:left w:val="none" w:color="auto" w:sz="0" w:space="0"/>
+                <w:bottom w:val="none" w:color="auto" w:sz="0" w:space="0"/>
+                <w:right w:val="none" w:color="auto" w:sz="0" w:space="0"/>
+                <w:insideH w:val="none" w:color="auto" w:sz="0" w:space="0"/>
+                <w:insideV w:val="none" w:color="auto" w:sz="0" w:space="0"/>
+              </w:tblBorders>
+              <w:tblLayout w:type="fixed"/>
+              <w:tblCellMar>
+                <w:top w:w="0" w:type="dxa"/>
+                <w:left w:w="0" w:type="dxa"/>
+                <w:bottom w:w="0" w:type="dxa"/>
+                <w:right w:w="0" w:type="dxa"/>
+              </w:tblCellMar>
+            </w:tblPr>
+            <w:tblGrid>
+              <w:gridCol w:w="9100"/>
+            </w:tblGrid>
+            <w:tr>
+              <w:tblPrEx>
+                <w:tblBorders>
+                  <w:top w:val="none" w:color="auto" w:sz="0" w:space="0"/>
+                  <w:left w:val="none" w:color="auto" w:sz="0" w:space="0"/>
+                  <w:bottom w:val="none" w:color="auto" w:sz="0" w:space="0"/>
+                  <w:right w:val="none" w:color="auto" w:sz="0" w:space="0"/>
+                  <w:insideH w:val="none" w:color="auto" w:sz="0" w:space="0"/>
+                  <w:insideV w:val="none" w:color="auto" w:sz="0" w:space="0"/>
+                </w:tblBorders>
+                <w:tblCellMar>
+                  <w:top w:w="0" w:type="dxa"/>
+                  <w:left w:w="0" w:type="dxa"/>
+                  <w:bottom w:w="0" w:type="dxa"/>
+                  <w:right w:w="0" w:type="dxa"/>
+                </w:tblCellMar>
+              </w:tblPrEx>
+              <w:trPr>
+                <w:cantSplit/>
+              </w:trPr>
+              <w:tc>
+                <w:tcPr>
+                  <w:tcW w:w="9100" w:type="dxa"/>
+                  <w:tcBorders>
+                    <w:tl2br w:val="nil"/>
+                    <w:tr2bl w:val="nil"/>
+                  </w:tcBorders>
+                </w:tcPr>
+                <w:p>
+                  <w:pPr>
+                    <w:keepNext w:val="0"/>
+                    <w:keepLines/>
+                    <w:pageBreakBefore w:val="0"/>
+                    <w:spacing w:beforeLines="50" w:after="100" w:line="240" w:lineRule="auto"/>
+                    <w:jc w:val="left"/>
+                    <w:rPr>
+                      <w:rFonts w:hint="default" w:ascii="Times New Roman" w:hAnsi="Times New Roman" w:eastAsia="宋体" w:cs="Times New Roman"/>
+                      <w:b w:val="0"/>
+                      <w:sz w:val="21"/>
+                      <w:szCs w:val="28"/>
+                      <w:vertAlign w:val="baseline"/>
+                      <w:lang w:val="en-US" w:eastAsia="zh-CN"/>
+                    </w:rPr>
+                  </w:pPr>
+                  <w:r>
+                    <w:rPr>
+                      <w:rFonts w:hint="default" w:ascii="Times New Roman" w:hAnsi="Times New Roman" w:eastAsia="宋体" w:cs="Times New Roman"/>
+                      <w:b/>
+                      <w:sz w:val="21"/>
+                      <w:szCs w:val="28"/>
+                      <w:vertAlign w:val="baseline"/>
+                      <w:lang w:val="en-US" w:eastAsia="zh-CN"/>
+                    </w:rPr>
+                    <w:t>4 LoRa可靠告警与通信对照</w:t>
+                  </w:r>
+                  <w:r>
+                    <w:rPr>
+                      <w:rFonts w:hint="default" w:ascii="Times New Roman" w:hAnsi="Times New Roman" w:eastAsia="宋体" w:cs="Times New Roman"/>
+                      <w:b w:val="0"/>
+                      <w:sz w:val="21"/>
+                      <w:szCs w:val="28"/>
+                      <w:vertAlign w:val="baseline"/>
+                      <w:lang w:val="en-US" w:eastAsia="zh-CN"/>
+                    </w:rPr>
+                    <w:br w:type="textWrapping"/>
+                  </w:r>
+                  <w:r>
+                    <w:rPr>
+                      <w:rFonts w:hint="default" w:ascii="Times New Roman" w:hAnsi="Times New Roman" w:eastAsia="宋体" w:cs="Times New Roman"/>
+                      <w:b w:val="0"/>
+                      <w:sz w:val="21"/>
+                      <w:szCs w:val="28"/>
+                      <w:vertAlign w:val="baseline"/>
+                      <w:lang w:val="en-US" w:eastAsia="zh-CN"/>
+                    </w:rPr>
+                    <w:t>比较快周期、慢周期、原始事件与滤波限频事件四种上报策略，协议见图7。</w:t>
+                  </w:r>
+                </w:p>
+              </w:tc>
+            </w:tr>
+          </w:tbl>
+          <w:p>
+            <w:pPr>
+              <w:keepNext/>
+              <w:keepLines/>
+              <w:spacing w:before="140" w:beforeLines="50" w:after="100" w:line="240" w:lineRule="auto"/>
+              <w:jc w:val="left"/>
+              <w:rPr>
+                <w:rFonts w:hint="default" w:ascii="Times New Roman" w:hAnsi="Times New Roman" w:eastAsia="宋体" w:cs="Times New Roman"/>
+                <w:b w:val="0"/>
+                <w:sz w:val="21"/>
+                <w:szCs w:val="28"/>
+                <w:lang w:val="en-US" w:eastAsia="zh-CN"/>
+              </w:rPr>
+            </w:pPr>
           </w:p>
           <w:p>
             <w:pPr>
@@ -5029,11 +5406,11 @@
                 <w:lang w:val="en-US" w:eastAsia="zh-CN"/>
               </w:rPr>
               <w:pict>
-                <v:shape id="_x0000_i1032" o:spt="75" alt="图7 候选量程与测量界限的模型核对 非实测" type="#_x0000_t75" style="height:357.45pt;width:425pt;" filled="f" o:preferrelative="t" stroked="f" coordsize="21600,21600">
+                <v:shape id="_x0000_i1032" o:spt="75" alt="图7 事件持久化、确认与重试时序设计" type="#_x0000_t75" style="height:262.75pt;width:425pt;" filled="f" o:preferrelative="t" stroked="f" coordsize="21600,21600">
                   <v:path/>
                   <v:fill on="f" focussize="0,0"/>
                   <v:stroke on="f"/>
-                  <v:imagedata r:id="rId12" o:title="hardware_feasibility"/>
+                  <v:imagedata r:id="rId12" o:title="protocol_sequence"/>
                   <o:lock v:ext="edit" aspectratio="t"/>
                   <w10:wrap type="none"/>
                   <w10:anchorlock/>
@@ -5056,7 +5433,7 @@
                 <w:szCs w:val="28"/>
                 <w:lang w:val="en-US" w:eastAsia="zh-CN"/>
               </w:rPr>
-              <w:t>图7 候选量程与测量界限的模型核对 非实测</w:t>
+              <w:t>图7 事件持久化、确认与重试时序设计</w:t>
             </w:r>
           </w:p>
           <w:p>
@@ -5079,7 +5456,53 @@
                 <w:szCs w:val="28"/>
                 <w:lang w:val="en-US" w:eastAsia="zh-CN"/>
               </w:rPr>
-              <w:t>另检查两故障、三供压、B开关及三程度共36组目标，修正受限范围后均可在模型内达到。仅按压力标称界限、10秒计数量化及流量±1%读数分析，健康与故障特征区间分离；若保守按5L/min满量程的1%分析，80kPa下两个5%泄漏组合区间重叠，弱异常不保证可分。流量精度定义须进一步核对，温漂、ADC、调理及安装误差尚未计入，不能转成实物检出率。模型P用kPa、Q用L/min，R与C量纲分别为kPa/(L/min)²和(L/min)/√kPa。</w:t>
+              <w:t>四策略保持采样、检测器、载荷及链路设置一致。事件包含设备、会话、序号、发生时间、状态、测量及质量；本地保存原始日志，经LoRa发送摘要。实物试验冻结缓存容量、超时、重试及掉电策略，并记录发收与确认时间。回放中的1秒ACK、4秒超时及16条队列仅为模型假设，实际值须依据模块与空中时间核定。</w:t>
+            </w:r>
+          </w:p>
+          <w:p>
+            <w:pPr>
+              <w:keepNext w:val="0"/>
+              <w:keepLines/>
+              <w:spacing w:beforeLines="50" w:after="100" w:line="240" w:lineRule="auto"/>
+              <w:jc w:val="left"/>
+              <w:rPr>
+                <w:rFonts w:hint="default" w:ascii="Times New Roman" w:hAnsi="Times New Roman" w:eastAsia="宋体" w:cs="Times New Roman"/>
+                <w:sz w:val="21"/>
+                <w:szCs w:val="28"/>
+                <w:lang w:val="en-US" w:eastAsia="zh-CN"/>
+              </w:rPr>
+            </w:pPr>
+            <w:r>
+              <w:rPr>
+                <w:rFonts w:hint="default" w:ascii="Times New Roman" w:hAnsi="Times New Roman" w:eastAsia="宋体" w:cs="Times New Roman"/>
+                <w:sz w:val="21"/>
+                <w:szCs w:val="28"/>
+                <w:lang w:val="en-US" w:eastAsia="zh-CN"/>
+              </w:rPr>
+              <w:t>接收端持久化后发送匹配ACK，重复事件再次确认但不重复存储，管理者的处理确认另记。节点仅移除已确认事件；重试耗尽仍保留待确认状态，队列满时记录丢弃或拒绝及缺口。掉电后恢复队列和会话，或明确标记无法恢复的记录。上述拟实施要求通过丢包、阻断和重启试验核对。</w:t>
+            </w:r>
+          </w:p>
+          <w:p>
+            <w:pPr>
+              <w:keepNext w:val="0"/>
+              <w:keepLines/>
+              <w:spacing w:beforeLines="50" w:after="100" w:line="240" w:lineRule="auto"/>
+              <w:jc w:val="left"/>
+              <w:rPr>
+                <w:rFonts w:hint="default" w:ascii="Times New Roman" w:hAnsi="Times New Roman" w:eastAsia="宋体" w:cs="Times New Roman"/>
+                <w:sz w:val="21"/>
+                <w:szCs w:val="28"/>
+                <w:lang w:val="en-US" w:eastAsia="zh-CN"/>
+              </w:rPr>
+            </w:pPr>
+            <w:r>
+              <w:rPr>
+                <w:rFonts w:hint="default" w:ascii="Times New Roman" w:hAnsi="Times New Roman" w:eastAsia="宋体" w:cs="Times New Roman"/>
+                <w:sz w:val="21"/>
+                <w:szCs w:val="28"/>
+                <w:lang w:val="en-US" w:eastAsia="zh-CN"/>
+              </w:rPr>
+              <w:t>通信评价分别测量故障至本地提示、本地提示至远端接收的延迟，统计上行与确认帧数及字节，并独立计量整机能量。射频配置、干扰、遮挡与静态功耗一并记录，不能以帧数代替续航结论。断链时显示离线及待补发，未收到事件不判为正常。</w:t>
             </w:r>
           </w:p>
           <w:p>
@@ -5104,7 +5527,7 @@
                 <w:szCs w:val="28"/>
                 <w:lang w:val="en-US" w:eastAsia="zh-CN"/>
               </w:rPr>
-              <w:t>3 渐进故障诊断与早期评价</w:t>
+              <w:t>5 管理软件与系统集成</w:t>
             </w:r>
             <w:r>
               <w:rPr>
@@ -5124,7 +5547,7 @@
                 <w:szCs w:val="28"/>
                 <w:lang w:val="en-US" w:eastAsia="zh-CN"/>
               </w:rPr>
-              <w:t>拟采用压力归一化流量K=Q/√P1和区段阻力估计R̂=(P0−P1)/Q²，分别描述下游等效负载及监测区段的阻力变化。程序在测量质量和运行状态满足条件后，比较同工况健康特征及误差区间，再检验偏离是否持续，处理分支见图8。健康参照、偏离阈值和持续条件由标定小试确定并在验证前冻结；故障期间不以自动更新参照消除异常。切换等待段仍保留原始数据，单独报告暂缓判断的时间、误报和漏检。</w:t>
+              <w:t>本地Web拟提供设备档案、支管位置示意、P0/P1/Q趋势、事件证据、质量状态、处理确认、历史回放与CSV导出。网页将区分测量时间、接收时间、模型回放和实际设备状态，提示检查供压、阀态、传感器与目标管路。接收端的数据持久化和真实节点接入是实施任务；已有离线页面完成合成回放与交互演示，其实际管理面板局部截图见图8。</w:t>
             </w:r>
           </w:p>
           <w:p>
@@ -5148,11 +5571,11 @@
                 <w:lang w:val="en-US" w:eastAsia="zh-CN"/>
               </w:rPr>
               <w:pict>
-                <v:shape id="_x0000_i1033" o:spt="75" alt="图8 状态辅助与有限故障模式诊断流程设计" type="#_x0000_t75" style="height:430.35pt;width:425pt;" filled="f" o:preferrelative="t" stroked="f" coordsize="21600,21600">
+                <v:shape id="_x0000_i1033" o:spt="75" alt="图8 已实现离线网页管理面板局部截图 合成回放 未连接实物" type="#_x0000_t75" style="height:434pt;width:425pt;" filled="f" o:preferrelative="t" stroked="f" coordsize="21600,21600">
                   <v:path/>
                   <v:fill on="f" focussize="0,0"/>
                   <v:stroke on="f"/>
-                  <v:imagedata r:id="rId13" o:title="diagnosis_flow"/>
+                  <v:imagedata r:id="rId13" o:title="platform_replay"/>
                   <o:lock v:ext="edit" aspectratio="t"/>
                   <w10:wrap type="none"/>
                   <w10:anchorlock/>
@@ -5175,337 +5598,7 @@
                 <w:szCs w:val="28"/>
                 <w:lang w:val="en-US" w:eastAsia="zh-CN"/>
               </w:rPr>
-              <w:t>图8 状态辅助与有限故障模式诊断流程设计</w:t>
-            </w:r>
-          </w:p>
-          <w:p>
-            <w:pPr>
-              <w:keepNext w:val="0"/>
-              <w:keepLines/>
-              <w:spacing w:beforeLines="50" w:after="100" w:line="240" w:lineRule="auto"/>
-              <w:jc w:val="left"/>
-              <w:rPr>
-                <w:rFonts w:hint="default" w:ascii="Times New Roman" w:hAnsi="Times New Roman" w:eastAsia="宋体" w:cs="Times New Roman"/>
-                <w:sz w:val="21"/>
-                <w:szCs w:val="28"/>
-                <w:lang w:val="en-US" w:eastAsia="zh-CN"/>
-              </w:rPr>
-            </w:pPr>
-            <w:r>
-              <w:rPr>
-                <w:rFonts w:hint="default" w:ascii="Times New Roman" w:hAnsi="Times New Roman" w:eastAsia="宋体" w:cs="Times New Roman"/>
-                <w:sz w:val="21"/>
-                <w:szCs w:val="28"/>
-                <w:lang w:val="en-US" w:eastAsia="zh-CN"/>
-              </w:rPr>
-              <w:t>输出分为等效泄漏模式、等效受限模式、异常待检查和数据无效。未知正常负载可能与泄漏同形，压力差分偏置可能与受限混淆；这类条件下保留异常证据并提示核查，不强制给出单一原因。定位精度限于被监测支管或压力点包围区段。</w:t>
-            </w:r>
-          </w:p>
-          <w:p>
-            <w:pPr>
-              <w:keepNext w:val="0"/>
-              <w:keepLines/>
-              <w:spacing w:beforeLines="50" w:after="100" w:line="240" w:lineRule="auto"/>
-              <w:jc w:val="left"/>
-              <w:rPr>
-                <w:rFonts w:hint="default" w:ascii="Times New Roman" w:hAnsi="Times New Roman" w:eastAsia="宋体" w:cs="Times New Roman"/>
-                <w:sz w:val="21"/>
-                <w:szCs w:val="28"/>
-                <w:lang w:val="en-US" w:eastAsia="zh-CN"/>
-              </w:rPr>
-            </w:pPr>
-            <w:r>
-              <w:rPr>
-                <w:rFonts w:hint="default" w:ascii="Times New Roman" w:hAnsi="Times New Roman" w:eastAsia="宋体" w:cs="Times New Roman"/>
-                <w:sz w:val="21"/>
-                <w:szCs w:val="28"/>
-                <w:lang w:val="en-US" w:eastAsia="zh-CN"/>
-              </w:rPr>
-              <w:t>模式提示附带P0/P1/Q、特征偏离、阀态、质量标志及参照编号。K增大而区段阻力稳定时检查等效泄漏或负载变化；区段阻力增大时检查等效受限，同时核查压力偏置。两个特征同时变化、状态不明或证据不足时，提示异常待检查。管理者据此确定核查顺序，真实原因最终以独立操作记录、参考测量及现场检查为依据。</w:t>
-            </w:r>
-          </w:p>
-          <w:p>
-            <w:pPr>
-              <w:keepNext w:val="0"/>
-              <w:keepLines/>
-              <w:spacing w:beforeLines="50" w:after="100" w:line="240" w:lineRule="auto"/>
-              <w:jc w:val="left"/>
-              <w:rPr>
-                <w:rFonts w:hint="default" w:ascii="Times New Roman" w:hAnsi="Times New Roman" w:eastAsia="宋体" w:cs="Times New Roman"/>
-                <w:sz w:val="21"/>
-                <w:szCs w:val="28"/>
-                <w:lang w:val="en-US" w:eastAsia="zh-CN"/>
-              </w:rPr>
-            </w:pPr>
-            <w:r>
-              <w:rPr>
-                <w:rFonts w:hint="default" w:ascii="Times New Roman" w:hAnsi="Times New Roman" w:eastAsia="宋体" w:cs="Times New Roman"/>
-                <w:sz w:val="21"/>
-                <w:szCs w:val="28"/>
-                <w:lang w:val="en-US" w:eastAsia="zh-CN"/>
-              </w:rPr>
-              <w:t>早期评价以独立参考测量确定的预设失效判据为终点，同时记录故障操作起点、本地首次可靠提示和远端首次接收。考察相对同工况健康流量偏离5%、10%、15%的暂定程度，绘制检出、误报及提前量随程度变化的关系。15%目前是模型演示参照，实际程度与失效判据由导师结合预实验审核后冻结。研究目标是找出可测、可判、可提前的条件及失败边界，性能阈值由有独立标签的小试确定。</w:t>
-            </w:r>
-          </w:p>
-          <w:p>
-            <w:pPr>
-              <w:keepNext/>
-              <w:keepLines/>
-              <w:spacing w:before="140" w:beforeLines="50" w:after="100" w:line="240" w:lineRule="auto"/>
-              <w:jc w:val="left"/>
-              <w:rPr>
-                <w:rFonts w:hint="default" w:ascii="Times New Roman" w:hAnsi="Times New Roman" w:eastAsia="宋体" w:cs="Times New Roman"/>
-                <w:b w:val="0"/>
-                <w:sz w:val="21"/>
-                <w:szCs w:val="28"/>
-                <w:lang w:val="en-US" w:eastAsia="zh-CN"/>
-              </w:rPr>
-            </w:pPr>
-            <w:r>
-              <w:rPr>
-                <w:rFonts w:hint="default" w:ascii="Times New Roman" w:hAnsi="Times New Roman" w:eastAsia="宋体" w:cs="Times New Roman"/>
-                <w:b/>
-                <w:sz w:val="21"/>
-                <w:szCs w:val="28"/>
-                <w:lang w:val="en-US" w:eastAsia="zh-CN"/>
-              </w:rPr>
-              <w:t>4 LoRa可靠告警与通信对照</w:t>
-            </w:r>
-            <w:r>
-              <w:rPr>
-                <w:rFonts w:hint="default" w:ascii="Times New Roman" w:hAnsi="Times New Roman" w:eastAsia="宋体" w:cs="Times New Roman"/>
-                <w:b w:val="0"/>
-                <w:sz w:val="21"/>
-                <w:szCs w:val="28"/>
-                <w:lang w:val="en-US" w:eastAsia="zh-CN"/>
-              </w:rPr>
-              <w:br w:type="textWrapping"/>
-            </w:r>
-            <w:r>
-              <w:rPr>
-                <w:rFonts w:hint="default" w:ascii="Times New Roman" w:hAnsi="Times New Roman" w:eastAsia="宋体" w:cs="Times New Roman"/>
-                <w:b w:val="0"/>
-                <w:sz w:val="21"/>
-                <w:szCs w:val="28"/>
-                <w:lang w:val="en-US" w:eastAsia="zh-CN"/>
-              </w:rPr>
-              <w:t>比较快周期、慢周期、原始事件与滤波限频事件四种上报策略，协议见图9。</w:t>
-            </w:r>
-          </w:p>
-          <w:p>
-            <w:pPr>
-              <w:keepNext w:val="0"/>
-              <w:keepLines/>
-              <w:spacing w:beforeLines="50" w:after="100" w:line="240" w:lineRule="auto"/>
-              <w:jc w:val="center"/>
-              <w:rPr>
-                <w:rFonts w:hint="default" w:ascii="Times New Roman" w:hAnsi="Times New Roman" w:eastAsia="宋体" w:cs="Times New Roman"/>
-                <w:sz w:val="21"/>
-                <w:szCs w:val="28"/>
-                <w:lang w:val="en-US" w:eastAsia="zh-CN"/>
-              </w:rPr>
-            </w:pPr>
-            <w:r>
-              <w:rPr>
-                <w:rFonts w:hint="default" w:ascii="Times New Roman" w:hAnsi="Times New Roman" w:eastAsia="宋体" w:cs="Times New Roman"/>
-                <w:sz w:val="21"/>
-                <w:szCs w:val="28"/>
-                <w:lang w:val="en-US" w:eastAsia="zh-CN"/>
-              </w:rPr>
-              <w:pict>
-                <v:shape id="_x0000_i1034" o:spt="75" alt="图9 事件缓存确认与接收去重的协议设计" type="#_x0000_t75" style="height:396.4pt;width:425pt;" filled="f" o:preferrelative="t" stroked="f" coordsize="21600,21600">
-                  <v:path/>
-                  <v:fill on="f" focussize="0,0"/>
-                  <v:stroke on="f"/>
-                  <v:imagedata r:id="rId14" o:title="protocol_loop"/>
-                  <o:lock v:ext="edit" aspectratio="t"/>
-                  <w10:wrap type="none"/>
-                  <w10:anchorlock/>
-                </v:shape>
-              </w:pict>
-            </w:r>
-            <w:r>
-              <w:rPr>
-                <w:rFonts w:hint="eastAsia" w:ascii="Times New Roman" w:hAnsi="Times New Roman" w:cs="Times New Roman"/>
-                <w:sz w:val="21"/>
-                <w:szCs w:val="28"/>
-                <w:lang w:val="en-US" w:eastAsia="zh-CN"/>
-              </w:rPr>
-              <w:br w:type="textWrapping"/>
-            </w:r>
-            <w:r>
-              <w:rPr>
-                <w:rFonts w:hint="eastAsia" w:ascii="Times New Roman" w:hAnsi="Times New Roman" w:cs="Times New Roman"/>
-                <w:sz w:val="18"/>
-                <w:szCs w:val="28"/>
-                <w:lang w:val="en-US" w:eastAsia="zh-CN"/>
-              </w:rPr>
-              <w:t>图9 事件缓存确认与接收去重的协议设计</w:t>
-            </w:r>
-          </w:p>
-          <w:p>
-            <w:pPr>
-              <w:keepNext w:val="0"/>
-              <w:keepLines/>
-              <w:spacing w:beforeLines="50" w:after="100" w:line="240" w:lineRule="auto"/>
-              <w:jc w:val="left"/>
-              <w:rPr>
-                <w:rFonts w:hint="default" w:ascii="Times New Roman" w:hAnsi="Times New Roman" w:eastAsia="宋体" w:cs="Times New Roman"/>
-                <w:sz w:val="21"/>
-                <w:szCs w:val="28"/>
-                <w:lang w:val="en-US" w:eastAsia="zh-CN"/>
-              </w:rPr>
-            </w:pPr>
-            <w:r>
-              <w:rPr>
-                <w:rFonts w:hint="default" w:ascii="Times New Roman" w:hAnsi="Times New Roman" w:eastAsia="宋体" w:cs="Times New Roman"/>
-                <w:sz w:val="21"/>
-                <w:szCs w:val="28"/>
-                <w:lang w:val="en-US" w:eastAsia="zh-CN"/>
-              </w:rPr>
-              <w:t>四策略保持采样、检测器、载荷及链路设置一致。事件包含设备、会话、序号、发生时间、状态、测量及质量；本地保存原始日志，经LoRa发送摘要。实物试验冻结缓存容量、超时、重试及掉电策略，并记录发收与确认时间。回放中的1秒ACK、4秒超时及16条队列仅为模型假设，实际值须依据模块与空中时间核定。</w:t>
-            </w:r>
-          </w:p>
-          <w:p>
-            <w:pPr>
-              <w:keepNext w:val="0"/>
-              <w:keepLines/>
-              <w:spacing w:beforeLines="50" w:after="100" w:line="240" w:lineRule="auto"/>
-              <w:jc w:val="left"/>
-              <w:rPr>
-                <w:rFonts w:hint="default" w:ascii="Times New Roman" w:hAnsi="Times New Roman" w:eastAsia="宋体" w:cs="Times New Roman"/>
-                <w:sz w:val="21"/>
-                <w:szCs w:val="28"/>
-                <w:lang w:val="en-US" w:eastAsia="zh-CN"/>
-              </w:rPr>
-            </w:pPr>
-            <w:r>
-              <w:rPr>
-                <w:rFonts w:hint="default" w:ascii="Times New Roman" w:hAnsi="Times New Roman" w:eastAsia="宋体" w:cs="Times New Roman"/>
-                <w:sz w:val="21"/>
-                <w:szCs w:val="28"/>
-                <w:lang w:val="en-US" w:eastAsia="zh-CN"/>
-              </w:rPr>
-              <w:t>接收端持久化后发送匹配ACK，重复事件再次确认但不重复存储，管理者的处理确认另记。节点仅移除已确认事件；重试耗尽仍保留待确认状态，队列满时记录丢弃或拒绝及缺口。掉电后恢复队列和会话，或明确标记无法恢复的记录。上述拟实施要求通过丢包、阻断和重启试验核对。</w:t>
-            </w:r>
-          </w:p>
-          <w:p>
-            <w:pPr>
-              <w:keepNext w:val="0"/>
-              <w:keepLines/>
-              <w:spacing w:beforeLines="50" w:after="100" w:line="240" w:lineRule="auto"/>
-              <w:jc w:val="left"/>
-              <w:rPr>
-                <w:rFonts w:hint="default" w:ascii="Times New Roman" w:hAnsi="Times New Roman" w:eastAsia="宋体" w:cs="Times New Roman"/>
-                <w:sz w:val="21"/>
-                <w:szCs w:val="28"/>
-                <w:lang w:val="en-US" w:eastAsia="zh-CN"/>
-              </w:rPr>
-            </w:pPr>
-            <w:r>
-              <w:rPr>
-                <w:rFonts w:hint="default" w:ascii="Times New Roman" w:hAnsi="Times New Roman" w:eastAsia="宋体" w:cs="Times New Roman"/>
-                <w:sz w:val="21"/>
-                <w:szCs w:val="28"/>
-                <w:lang w:val="en-US" w:eastAsia="zh-CN"/>
-              </w:rPr>
-              <w:t>通信评价分别测量故障至本地提示、本地提示至远端接收的延迟，统计上行与确认帧数及字节，并独立计量整机能量。射频配置、干扰、遮挡与静态功耗一并记录，不能以帧数代替续航结论。断链时显示离线及待补发，未收到事件不判为正常。</w:t>
-            </w:r>
-          </w:p>
-          <w:p>
-            <w:pPr>
-              <w:keepNext/>
-              <w:keepLines/>
-              <w:spacing w:before="140" w:beforeLines="50" w:after="100" w:line="240" w:lineRule="auto"/>
-              <w:jc w:val="left"/>
-              <w:rPr>
-                <w:rFonts w:hint="default" w:ascii="Times New Roman" w:hAnsi="Times New Roman" w:eastAsia="宋体" w:cs="Times New Roman"/>
-                <w:b w:val="0"/>
-                <w:sz w:val="21"/>
-                <w:szCs w:val="28"/>
-                <w:lang w:val="en-US" w:eastAsia="zh-CN"/>
-              </w:rPr>
-            </w:pPr>
-            <w:r>
-              <w:rPr>
-                <w:rFonts w:hint="default" w:ascii="Times New Roman" w:hAnsi="Times New Roman" w:eastAsia="宋体" w:cs="Times New Roman"/>
-                <w:b/>
-                <w:sz w:val="21"/>
-                <w:szCs w:val="28"/>
-                <w:lang w:val="en-US" w:eastAsia="zh-CN"/>
-              </w:rPr>
-              <w:t>5 管理软件与系统集成</w:t>
-            </w:r>
-            <w:r>
-              <w:rPr>
-                <w:rFonts w:hint="default" w:ascii="Times New Roman" w:hAnsi="Times New Roman" w:eastAsia="宋体" w:cs="Times New Roman"/>
-                <w:b w:val="0"/>
-                <w:sz w:val="21"/>
-                <w:szCs w:val="28"/>
-                <w:lang w:val="en-US" w:eastAsia="zh-CN"/>
-              </w:rPr>
-              <w:br w:type="textWrapping"/>
-            </w:r>
-            <w:r>
-              <w:rPr>
-                <w:rFonts w:hint="default" w:ascii="Times New Roman" w:hAnsi="Times New Roman" w:eastAsia="宋体" w:cs="Times New Roman"/>
-                <w:b w:val="0"/>
-                <w:sz w:val="21"/>
-                <w:szCs w:val="28"/>
-                <w:lang w:val="en-US" w:eastAsia="zh-CN"/>
-              </w:rPr>
-              <w:t>本地Web拟提供设备档案、支管位置示意、P0/P1/Q趋势、事件证据、质量状态、处理确认、历史回放与CSV导出。网页将区分测量时间、接收时间、模型回放和实际设备状态，提示检查供压、阀态、传感器与目标管路。接收端的数据持久化和真实节点接入是实施任务；已有离线页面完成合成回放与交互演示，其实际运行截图见图10。</w:t>
-            </w:r>
-          </w:p>
-          <w:p>
-            <w:pPr>
-              <w:keepNext w:val="0"/>
-              <w:keepLines/>
-              <w:spacing w:beforeLines="50" w:after="100" w:line="240" w:lineRule="auto"/>
-              <w:jc w:val="center"/>
-              <w:rPr>
-                <w:rFonts w:hint="default" w:ascii="Times New Roman" w:hAnsi="Times New Roman" w:eastAsia="宋体" w:cs="Times New Roman"/>
-                <w:sz w:val="21"/>
-                <w:szCs w:val="28"/>
-                <w:lang w:val="en-US" w:eastAsia="zh-CN"/>
-              </w:rPr>
-            </w:pPr>
-            <w:r>
-              <w:rPr>
-                <w:rFonts w:hint="default" w:ascii="Times New Roman" w:hAnsi="Times New Roman" w:eastAsia="宋体" w:cs="Times New Roman"/>
-                <w:sz w:val="21"/>
-                <w:szCs w:val="28"/>
-                <w:lang w:val="en-US" w:eastAsia="zh-CN"/>
-              </w:rPr>
-              <w:pict>
-                <v:shape id="_x0000_i1035" o:spt="75" alt="图10 已实现离线网页的合成诊断回放截图 尚未连接实物" type="#_x0000_t75" style="height:350.5pt;width:425pt;" filled="f" o:preferrelative="t" stroked="f" coordsize="21600,21600">
-                  <v:path/>
-                  <v:fill on="f" focussize="0,0"/>
-                  <v:stroke on="f"/>
-                  <v:imagedata r:id="rId15" o:title="platform_replay"/>
-                  <o:lock v:ext="edit" aspectratio="t"/>
-                  <w10:wrap type="none"/>
-                  <w10:anchorlock/>
-                </v:shape>
-              </w:pict>
-            </w:r>
-            <w:r>
-              <w:rPr>
-                <w:rFonts w:hint="eastAsia" w:ascii="Times New Roman" w:hAnsi="Times New Roman" w:cs="Times New Roman"/>
-                <w:sz w:val="21"/>
-                <w:szCs w:val="28"/>
-                <w:lang w:val="en-US" w:eastAsia="zh-CN"/>
-              </w:rPr>
-              <w:br w:type="textWrapping"/>
-            </w:r>
-            <w:r>
-              <w:rPr>
-                <w:rFonts w:hint="eastAsia" w:ascii="Times New Roman" w:hAnsi="Times New Roman" w:cs="Times New Roman"/>
-                <w:sz w:val="18"/>
-                <w:szCs w:val="28"/>
-                <w:lang w:val="en-US" w:eastAsia="zh-CN"/>
-              </w:rPr>
-              <w:t>图10 已实现离线网页的合成诊断回放截图 尚未连接实物</w:t>
+              <w:t>图8 已实现离线网页管理面板局部截图 合成回放 未连接实物</w:t>
             </w:r>
           </w:p>
           <w:p>
@@ -5670,9 +5763,9 @@
                     </w:tblBorders>
                     <w:tblLayout w:type="fixed"/>
                     <w:tblCellMar>
-                      <w:top w:w="100" w:type="dxa"/>
+                      <w:top w:w="60" w:type="dxa"/>
                       <w:left w:w="100" w:type="dxa"/>
-                      <w:bottom w:w="100" w:type="dxa"/>
+                      <w:bottom w:w="60" w:type="dxa"/>
                       <w:right w:w="100" w:type="dxa"/>
                     </w:tblCellMar>
                   </w:tblPr>
@@ -5692,9 +5785,9 @@
                         <w:insideV w:val="single" w:color="D9D9D9" w:sz="2" w:space="0"/>
                       </w:tblBorders>
                       <w:tblCellMar>
-                        <w:top w:w="100" w:type="dxa"/>
+                        <w:top w:w="60" w:type="dxa"/>
                         <w:left w:w="100" w:type="dxa"/>
-                        <w:bottom w:w="100" w:type="dxa"/>
+                        <w:bottom w:w="60" w:type="dxa"/>
                         <w:right w:w="100" w:type="dxa"/>
                       </w:tblCellMar>
                     </w:tblPrEx>
@@ -5716,7 +5809,7 @@
                         <w:pPr>
                           <w:keepNext/>
                           <w:keepLines/>
-                          <w:spacing w:beforeLines="50" w:after="80" w:line="240" w:lineRule="auto"/>
+                          <w:spacing w:beforeLines="50" w:after="40" w:line="240" w:lineRule="auto"/>
                           <w:jc w:val="left"/>
                           <w:rPr>
                             <w:rFonts w:hint="default" w:ascii="Times New Roman" w:hAnsi="Times New Roman" w:eastAsia="宋体" w:cs="Times New Roman"/>
@@ -5754,7 +5847,7 @@
                         <w:pPr>
                           <w:keepNext/>
                           <w:keepLines/>
-                          <w:spacing w:beforeLines="50" w:after="80" w:line="240" w:lineRule="auto"/>
+                          <w:spacing w:beforeLines="50" w:after="40" w:line="240" w:lineRule="auto"/>
                           <w:jc w:val="left"/>
                           <w:rPr>
                             <w:rFonts w:hint="default" w:ascii="Times New Roman" w:hAnsi="Times New Roman" w:eastAsia="宋体" w:cs="Times New Roman"/>
@@ -5792,7 +5885,7 @@
                         <w:pPr>
                           <w:keepNext/>
                           <w:keepLines/>
-                          <w:spacing w:beforeLines="50" w:after="80" w:line="240" w:lineRule="auto"/>
+                          <w:spacing w:beforeLines="50" w:after="40" w:line="240" w:lineRule="auto"/>
                           <w:jc w:val="left"/>
                           <w:rPr>
                             <w:rFonts w:hint="default" w:ascii="Times New Roman" w:hAnsi="Times New Roman" w:eastAsia="宋体" w:cs="Times New Roman"/>
@@ -5828,9 +5921,9 @@
                         <w:insideV w:val="single" w:color="D9D9D9" w:sz="2" w:space="0"/>
                       </w:tblBorders>
                       <w:tblCellMar>
-                        <w:top w:w="100" w:type="dxa"/>
+                        <w:top w:w="60" w:type="dxa"/>
                         <w:left w:w="100" w:type="dxa"/>
-                        <w:bottom w:w="100" w:type="dxa"/>
+                        <w:bottom w:w="60" w:type="dxa"/>
                         <w:right w:w="100" w:type="dxa"/>
                       </w:tblCellMar>
                     </w:tblPrEx>
@@ -5851,7 +5944,7 @@
                         <w:pPr>
                           <w:keepNext/>
                           <w:keepLines/>
-                          <w:spacing w:beforeLines="50" w:after="80" w:line="240" w:lineRule="auto"/>
+                          <w:spacing w:beforeLines="50" w:after="40" w:line="240" w:lineRule="auto"/>
                           <w:jc w:val="left"/>
                           <w:rPr>
                             <w:rFonts w:hint="default" w:ascii="Times New Roman" w:hAnsi="Times New Roman" w:eastAsia="宋体" w:cs="Times New Roman"/>
@@ -5889,7 +5982,7 @@
                         <w:pPr>
                           <w:keepNext/>
                           <w:keepLines/>
-                          <w:spacing w:beforeLines="50" w:after="80" w:line="240" w:lineRule="auto"/>
+                          <w:spacing w:beforeLines="50" w:after="40" w:line="240" w:lineRule="auto"/>
                           <w:jc w:val="left"/>
                           <w:rPr>
                             <w:rFonts w:hint="default" w:ascii="Times New Roman" w:hAnsi="Times New Roman" w:eastAsia="宋体" w:cs="Times New Roman"/>
@@ -5927,7 +6020,7 @@
                         <w:pPr>
                           <w:keepNext/>
                           <w:keepLines/>
-                          <w:spacing w:beforeLines="50" w:after="80" w:line="240" w:lineRule="auto"/>
+                          <w:spacing w:beforeLines="50" w:after="40" w:line="240" w:lineRule="auto"/>
                           <w:jc w:val="left"/>
                           <w:rPr>
                             <w:rFonts w:hint="default" w:ascii="Times New Roman" w:hAnsi="Times New Roman" w:eastAsia="宋体" w:cs="Times New Roman"/>
@@ -5963,9 +6056,9 @@
                         <w:insideV w:val="single" w:color="D9D9D9" w:sz="2" w:space="0"/>
                       </w:tblBorders>
                       <w:tblCellMar>
-                        <w:top w:w="100" w:type="dxa"/>
+                        <w:top w:w="60" w:type="dxa"/>
                         <w:left w:w="100" w:type="dxa"/>
-                        <w:bottom w:w="100" w:type="dxa"/>
+                        <w:bottom w:w="60" w:type="dxa"/>
                         <w:right w:w="100" w:type="dxa"/>
                       </w:tblCellMar>
                     </w:tblPrEx>
@@ -5986,7 +6079,7 @@
                         <w:pPr>
                           <w:keepNext/>
                           <w:keepLines/>
-                          <w:spacing w:beforeLines="50" w:after="80" w:line="240" w:lineRule="auto"/>
+                          <w:spacing w:beforeLines="50" w:after="40" w:line="240" w:lineRule="auto"/>
                           <w:jc w:val="left"/>
                           <w:rPr>
                             <w:rFonts w:hint="default" w:ascii="Times New Roman" w:hAnsi="Times New Roman" w:eastAsia="宋体" w:cs="Times New Roman"/>
@@ -6024,7 +6117,7 @@
                         <w:pPr>
                           <w:keepNext/>
                           <w:keepLines/>
-                          <w:spacing w:beforeLines="50" w:after="80" w:line="240" w:lineRule="auto"/>
+                          <w:spacing w:beforeLines="50" w:after="40" w:line="240" w:lineRule="auto"/>
                           <w:jc w:val="left"/>
                           <w:rPr>
                             <w:rFonts w:hint="default" w:ascii="Times New Roman" w:hAnsi="Times New Roman" w:eastAsia="宋体" w:cs="Times New Roman"/>
@@ -6062,7 +6155,7 @@
                         <w:pPr>
                           <w:keepNext/>
                           <w:keepLines/>
-                          <w:spacing w:beforeLines="50" w:after="80" w:line="240" w:lineRule="auto"/>
+                          <w:spacing w:beforeLines="50" w:after="40" w:line="240" w:lineRule="auto"/>
                           <w:jc w:val="left"/>
                           <w:rPr>
                             <w:rFonts w:hint="default" w:ascii="Times New Roman" w:hAnsi="Times New Roman" w:eastAsia="宋体" w:cs="Times New Roman"/>
@@ -6098,9 +6191,9 @@
                         <w:insideV w:val="single" w:color="D9D9D9" w:sz="2" w:space="0"/>
                       </w:tblBorders>
                       <w:tblCellMar>
-                        <w:top w:w="100" w:type="dxa"/>
+                        <w:top w:w="60" w:type="dxa"/>
                         <w:left w:w="100" w:type="dxa"/>
-                        <w:bottom w:w="100" w:type="dxa"/>
+                        <w:bottom w:w="60" w:type="dxa"/>
                         <w:right w:w="100" w:type="dxa"/>
                       </w:tblCellMar>
                     </w:tblPrEx>
@@ -6121,7 +6214,7 @@
                         <w:pPr>
                           <w:keepNext/>
                           <w:keepLines/>
-                          <w:spacing w:beforeLines="50" w:after="80" w:line="240" w:lineRule="auto"/>
+                          <w:spacing w:beforeLines="50" w:after="40" w:line="240" w:lineRule="auto"/>
                           <w:jc w:val="left"/>
                           <w:rPr>
                             <w:rFonts w:hint="default" w:ascii="Times New Roman" w:hAnsi="Times New Roman" w:eastAsia="宋体" w:cs="Times New Roman"/>
@@ -6159,7 +6252,7 @@
                         <w:pPr>
                           <w:keepNext/>
                           <w:keepLines/>
-                          <w:spacing w:beforeLines="50" w:after="80" w:line="240" w:lineRule="auto"/>
+                          <w:spacing w:beforeLines="50" w:after="40" w:line="240" w:lineRule="auto"/>
                           <w:jc w:val="left"/>
                           <w:rPr>
                             <w:rFonts w:hint="default" w:ascii="Times New Roman" w:hAnsi="Times New Roman" w:eastAsia="宋体" w:cs="Times New Roman"/>
@@ -6197,7 +6290,7 @@
                         <w:pPr>
                           <w:keepNext/>
                           <w:keepLines/>
-                          <w:spacing w:beforeLines="50" w:after="80" w:line="240" w:lineRule="auto"/>
+                          <w:spacing w:beforeLines="50" w:after="40" w:line="240" w:lineRule="auto"/>
                           <w:jc w:val="left"/>
                           <w:rPr>
                             <w:rFonts w:hint="default" w:ascii="Times New Roman" w:hAnsi="Times New Roman" w:eastAsia="宋体" w:cs="Times New Roman"/>
@@ -6233,9 +6326,9 @@
                         <w:insideV w:val="single" w:color="D9D9D9" w:sz="2" w:space="0"/>
                       </w:tblBorders>
                       <w:tblCellMar>
-                        <w:top w:w="100" w:type="dxa"/>
+                        <w:top w:w="60" w:type="dxa"/>
                         <w:left w:w="100" w:type="dxa"/>
-                        <w:bottom w:w="100" w:type="dxa"/>
+                        <w:bottom w:w="60" w:type="dxa"/>
                         <w:right w:w="100" w:type="dxa"/>
                       </w:tblCellMar>
                     </w:tblPrEx>
@@ -6256,7 +6349,7 @@
                         <w:pPr>
                           <w:keepNext/>
                           <w:keepLines/>
-                          <w:spacing w:beforeLines="50" w:after="80" w:line="240" w:lineRule="auto"/>
+                          <w:spacing w:beforeLines="50" w:after="40" w:line="240" w:lineRule="auto"/>
                           <w:jc w:val="left"/>
                           <w:rPr>
                             <w:rFonts w:hint="default" w:ascii="Times New Roman" w:hAnsi="Times New Roman" w:eastAsia="宋体" w:cs="Times New Roman"/>
@@ -6294,7 +6387,7 @@
                         <w:pPr>
                           <w:keepNext/>
                           <w:keepLines/>
-                          <w:spacing w:beforeLines="50" w:after="80" w:line="240" w:lineRule="auto"/>
+                          <w:spacing w:beforeLines="50" w:after="40" w:line="240" w:lineRule="auto"/>
                           <w:jc w:val="left"/>
                           <w:rPr>
                             <w:rFonts w:hint="default" w:ascii="Times New Roman" w:hAnsi="Times New Roman" w:eastAsia="宋体" w:cs="Times New Roman"/>
@@ -6332,7 +6425,7 @@
                         <w:pPr>
                           <w:keepNext/>
                           <w:keepLines/>
-                          <w:spacing w:beforeLines="50" w:after="80" w:line="240" w:lineRule="auto"/>
+                          <w:spacing w:beforeLines="50" w:after="40" w:line="240" w:lineRule="auto"/>
                           <w:jc w:val="left"/>
                           <w:rPr>
                             <w:rFonts w:hint="default" w:ascii="Times New Roman" w:hAnsi="Times New Roman" w:eastAsia="宋体" w:cs="Times New Roman"/>
@@ -6368,9 +6461,9 @@
                         <w:insideV w:val="single" w:color="D9D9D9" w:sz="2" w:space="0"/>
                       </w:tblBorders>
                       <w:tblCellMar>
-                        <w:top w:w="100" w:type="dxa"/>
+                        <w:top w:w="60" w:type="dxa"/>
                         <w:left w:w="100" w:type="dxa"/>
-                        <w:bottom w:w="100" w:type="dxa"/>
+                        <w:bottom w:w="60" w:type="dxa"/>
                         <w:right w:w="100" w:type="dxa"/>
                       </w:tblCellMar>
                     </w:tblPrEx>
@@ -6391,7 +6484,7 @@
                         <w:pPr>
                           <w:keepNext w:val="0"/>
                           <w:keepLines/>
-                          <w:spacing w:beforeLines="50" w:after="80" w:line="240" w:lineRule="auto"/>
+                          <w:spacing w:beforeLines="50" w:after="40" w:line="240" w:lineRule="auto"/>
                           <w:jc w:val="left"/>
                           <w:rPr>
                             <w:rFonts w:hint="default" w:ascii="Times New Roman" w:hAnsi="Times New Roman" w:eastAsia="宋体" w:cs="Times New Roman"/>
@@ -6429,7 +6522,7 @@
                         <w:pPr>
                           <w:keepNext w:val="0"/>
                           <w:keepLines/>
-                          <w:spacing w:beforeLines="50" w:after="80" w:line="240" w:lineRule="auto"/>
+                          <w:spacing w:beforeLines="50" w:after="40" w:line="240" w:lineRule="auto"/>
                           <w:jc w:val="left"/>
                           <w:rPr>
                             <w:rFonts w:hint="default" w:ascii="Times New Roman" w:hAnsi="Times New Roman" w:eastAsia="宋体" w:cs="Times New Roman"/>
@@ -6467,7 +6560,7 @@
                         <w:pPr>
                           <w:keepNext w:val="0"/>
                           <w:keepLines/>
-                          <w:spacing w:beforeLines="50" w:after="80" w:line="240" w:lineRule="auto"/>
+                          <w:spacing w:beforeLines="50" w:after="40" w:line="240" w:lineRule="auto"/>
                           <w:jc w:val="left"/>
                           <w:rPr>
                             <w:rFonts w:hint="default" w:ascii="Times New Roman" w:hAnsi="Times New Roman" w:eastAsia="宋体" w:cs="Times New Roman"/>
@@ -6545,7 +6638,7 @@
                 <w:szCs w:val="28"/>
                 <w:lang w:val="en-US" w:eastAsia="zh-CN"/>
               </w:rPr>
-              <w:t>图11给出预实验、独立操作、跨批次验证、通信对照与归档的先后关系。预实验决定测量和判据能否进入验证；正式验证同时支撑结项演示与论文论证。主要故障网格的重复次数按独立操作计算，通信策略比较使用同一组本地检测记录，以减少检测差异对链路结论的干扰。</w:t>
+              <w:t>验证分为以下四层，与表2的任务、证据和表3的阶段进度对应。预实验决定测量和判据能否进入验证；正式验证同时支撑结项演示与论文论证。主要故障网格的重复次数按独立操作计算，通信策略比较使用同一组本地检测记录，以减少检测差异对链路结论的干扰。</w:t>
             </w:r>
           </w:p>
           <w:p>
@@ -6592,57 +6685,6 @@
                 <w:lang w:val="en-US" w:eastAsia="zh-CN"/>
               </w:rPr>
               <w:t>第二层为水力与方法实验：安排正常稳定、正常切换、渐进泄漏、渐进受限和切换期间异常五组工况。以独立操作日志、参考流量和泄漏收集量确定故障时间与程度；主要故障网格至少54次，正常及切换对照另行安排。小试用于调参，验证按独立日或批次留出，相邻采样点不算独立重复。</w:t>
-            </w:r>
-          </w:p>
-          <w:p>
-            <w:pPr>
-              <w:keepNext w:val="0"/>
-              <w:keepLines/>
-              <w:spacing w:beforeLines="50" w:after="100" w:line="240" w:lineRule="auto"/>
-              <w:jc w:val="center"/>
-              <w:rPr>
-                <w:rFonts w:hint="default" w:ascii="Times New Roman" w:hAnsi="Times New Roman" w:eastAsia="宋体" w:cs="Times New Roman"/>
-                <w:sz w:val="21"/>
-                <w:szCs w:val="28"/>
-                <w:lang w:val="en-US" w:eastAsia="zh-CN"/>
-              </w:rPr>
-            </w:pPr>
-            <w:r>
-              <w:rPr>
-                <w:rFonts w:hint="default" w:ascii="Times New Roman" w:hAnsi="Times New Roman" w:eastAsia="宋体" w:cs="Times New Roman"/>
-                <w:sz w:val="21"/>
-                <w:szCs w:val="28"/>
-                <w:lang w:val="en-US" w:eastAsia="zh-CN"/>
-              </w:rPr>
-              <w:pict>
-                <v:shape id="_x0000_i1036" o:spt="75" alt="图11 从测量预实验到结项与论文的验证流程 拟实施" type="#_x0000_t75" style="height:409.95pt;width:425pt;" filled="f" o:preferrelative="t" stroked="f" coordsize="21600,21600">
-                  <v:path/>
-                  <v:fill on="f" focussize="0,0"/>
-                  <v:stroke on="f"/>
-                  <v:imagedata r:id="rId16" o:title="experiment_flow"/>
-                  <o:lock v:ext="edit" aspectratio="t"/>
-                  <w10:wrap type="none"/>
-                  <w10:anchorlock/>
-                </v:shape>
-              </w:pict>
-            </w:r>
-            <w:r>
-              <w:rPr>
-                <w:rFonts w:hint="eastAsia" w:ascii="Times New Roman" w:hAnsi="Times New Roman" w:cs="Times New Roman"/>
-                <w:sz w:val="21"/>
-                <w:szCs w:val="28"/>
-                <w:lang w:val="en-US" w:eastAsia="zh-CN"/>
-              </w:rPr>
-              <w:br w:type="textWrapping"/>
-            </w:r>
-            <w:r>
-              <w:rPr>
-                <w:rFonts w:hint="eastAsia" w:ascii="Times New Roman" w:hAnsi="Times New Roman" w:cs="Times New Roman"/>
-                <w:sz w:val="18"/>
-                <w:szCs w:val="28"/>
-                <w:lang w:val="en-US" w:eastAsia="zh-CN"/>
-              </w:rPr>
-              <w:t>图11 从测量预实验到结项与论文的验证流程 拟实施</w:t>
             </w:r>
           </w:p>
           <w:p>
@@ -8688,9 +8730,9 @@
                     </w:tblBorders>
                     <w:tblLayout w:type="fixed"/>
                     <w:tblCellMar>
-                      <w:top w:w="100" w:type="dxa"/>
+                      <w:top w:w="60" w:type="dxa"/>
                       <w:left w:w="100" w:type="dxa"/>
-                      <w:bottom w:w="100" w:type="dxa"/>
+                      <w:bottom w:w="60" w:type="dxa"/>
                       <w:right w:w="100" w:type="dxa"/>
                     </w:tblCellMar>
                   </w:tblPr>
@@ -8710,9 +8752,9 @@
                         <w:insideV w:val="single" w:color="D9D9D9" w:sz="2" w:space="0"/>
                       </w:tblBorders>
                       <w:tblCellMar>
-                        <w:top w:w="100" w:type="dxa"/>
+                        <w:top w:w="60" w:type="dxa"/>
                         <w:left w:w="100" w:type="dxa"/>
-                        <w:bottom w:w="100" w:type="dxa"/>
+                        <w:bottom w:w="60" w:type="dxa"/>
                         <w:right w:w="100" w:type="dxa"/>
                       </w:tblCellMar>
                     </w:tblPrEx>
@@ -8734,7 +8776,7 @@
                         <w:pPr>
                           <w:keepNext/>
                           <w:keepLines/>
-                          <w:spacing w:beforeLines="50" w:after="80" w:line="240" w:lineRule="auto"/>
+                          <w:spacing w:beforeLines="50" w:after="40" w:line="240" w:lineRule="auto"/>
                           <w:jc w:val="left"/>
                           <w:rPr>
                             <w:rFonts w:hint="default" w:ascii="Times New Roman" w:hAnsi="Times New Roman" w:eastAsia="宋体" w:cs="Times New Roman"/>
@@ -8772,7 +8814,7 @@
                         <w:pPr>
                           <w:keepNext/>
                           <w:keepLines/>
-                          <w:spacing w:beforeLines="50" w:after="80" w:line="240" w:lineRule="auto"/>
+                          <w:spacing w:beforeLines="50" w:after="40" w:line="240" w:lineRule="auto"/>
                           <w:jc w:val="left"/>
                           <w:rPr>
                             <w:rFonts w:hint="default" w:ascii="Times New Roman" w:hAnsi="Times New Roman" w:eastAsia="宋体" w:cs="Times New Roman"/>
@@ -8810,7 +8852,7 @@
                         <w:pPr>
                           <w:keepNext/>
                           <w:keepLines/>
-                          <w:spacing w:beforeLines="50" w:after="80" w:line="240" w:lineRule="auto"/>
+                          <w:spacing w:beforeLines="50" w:after="40" w:line="240" w:lineRule="auto"/>
                           <w:jc w:val="left"/>
                           <w:rPr>
                             <w:rFonts w:hint="default" w:ascii="Times New Roman" w:hAnsi="Times New Roman" w:eastAsia="宋体" w:cs="Times New Roman"/>
@@ -8846,9 +8888,9 @@
                         <w:insideV w:val="single" w:color="D9D9D9" w:sz="2" w:space="0"/>
                       </w:tblBorders>
                       <w:tblCellMar>
-                        <w:top w:w="100" w:type="dxa"/>
+                        <w:top w:w="60" w:type="dxa"/>
                         <w:left w:w="100" w:type="dxa"/>
-                        <w:bottom w:w="100" w:type="dxa"/>
+                        <w:bottom w:w="60" w:type="dxa"/>
                         <w:right w:w="100" w:type="dxa"/>
                       </w:tblCellMar>
                     </w:tblPrEx>
@@ -8869,7 +8911,7 @@
                         <w:pPr>
                           <w:keepNext/>
                           <w:keepLines/>
-                          <w:spacing w:beforeLines="50" w:after="80" w:line="240" w:lineRule="auto"/>
+                          <w:spacing w:beforeLines="50" w:after="40" w:line="240" w:lineRule="auto"/>
                           <w:jc w:val="left"/>
                           <w:rPr>
                             <w:rFonts w:hint="default" w:ascii="Times New Roman" w:hAnsi="Times New Roman" w:eastAsia="宋体" w:cs="Times New Roman"/>
@@ -8907,7 +8949,7 @@
                         <w:pPr>
                           <w:keepNext/>
                           <w:keepLines/>
-                          <w:spacing w:beforeLines="50" w:after="80" w:line="240" w:lineRule="auto"/>
+                          <w:spacing w:beforeLines="50" w:after="40" w:line="240" w:lineRule="auto"/>
                           <w:jc w:val="left"/>
                           <w:rPr>
                             <w:rFonts w:hint="default" w:ascii="Times New Roman" w:hAnsi="Times New Roman" w:eastAsia="宋体" w:cs="Times New Roman"/>
@@ -8945,7 +8987,7 @@
                         <w:pPr>
                           <w:keepNext/>
                           <w:keepLines/>
-                          <w:spacing w:beforeLines="50" w:after="80" w:line="240" w:lineRule="auto"/>
+                          <w:spacing w:beforeLines="50" w:after="40" w:line="240" w:lineRule="auto"/>
                           <w:jc w:val="left"/>
                           <w:rPr>
                             <w:rFonts w:hint="default" w:ascii="Times New Roman" w:hAnsi="Times New Roman" w:eastAsia="宋体" w:cs="Times New Roman"/>
@@ -8981,9 +9023,9 @@
                         <w:insideV w:val="single" w:color="D9D9D9" w:sz="2" w:space="0"/>
                       </w:tblBorders>
                       <w:tblCellMar>
-                        <w:top w:w="100" w:type="dxa"/>
+                        <w:top w:w="60" w:type="dxa"/>
                         <w:left w:w="100" w:type="dxa"/>
-                        <w:bottom w:w="100" w:type="dxa"/>
+                        <w:bottom w:w="60" w:type="dxa"/>
                         <w:right w:w="100" w:type="dxa"/>
                       </w:tblCellMar>
                     </w:tblPrEx>
@@ -9004,7 +9046,7 @@
                         <w:pPr>
                           <w:keepNext/>
                           <w:keepLines/>
-                          <w:spacing w:beforeLines="50" w:after="80" w:line="240" w:lineRule="auto"/>
+                          <w:spacing w:beforeLines="50" w:after="40" w:line="240" w:lineRule="auto"/>
                           <w:jc w:val="left"/>
                           <w:rPr>
                             <w:rFonts w:hint="default" w:ascii="Times New Roman" w:hAnsi="Times New Roman" w:eastAsia="宋体" w:cs="Times New Roman"/>
@@ -9042,7 +9084,7 @@
                         <w:pPr>
                           <w:keepNext/>
                           <w:keepLines/>
-                          <w:spacing w:beforeLines="50" w:after="80" w:line="240" w:lineRule="auto"/>
+                          <w:spacing w:beforeLines="50" w:after="40" w:line="240" w:lineRule="auto"/>
                           <w:jc w:val="left"/>
                           <w:rPr>
                             <w:rFonts w:hint="default" w:ascii="Times New Roman" w:hAnsi="Times New Roman" w:eastAsia="宋体" w:cs="Times New Roman"/>
@@ -9080,7 +9122,7 @@
                         <w:pPr>
                           <w:keepNext/>
                           <w:keepLines/>
-                          <w:spacing w:beforeLines="50" w:after="80" w:line="240" w:lineRule="auto"/>
+                          <w:spacing w:beforeLines="50" w:after="40" w:line="240" w:lineRule="auto"/>
                           <w:jc w:val="left"/>
                           <w:rPr>
                             <w:rFonts w:hint="default" w:ascii="Times New Roman" w:hAnsi="Times New Roman" w:eastAsia="宋体" w:cs="Times New Roman"/>
@@ -9116,9 +9158,9 @@
                         <w:insideV w:val="single" w:color="D9D9D9" w:sz="2" w:space="0"/>
                       </w:tblBorders>
                       <w:tblCellMar>
-                        <w:top w:w="100" w:type="dxa"/>
+                        <w:top w:w="60" w:type="dxa"/>
                         <w:left w:w="100" w:type="dxa"/>
-                        <w:bottom w:w="100" w:type="dxa"/>
+                        <w:bottom w:w="60" w:type="dxa"/>
                         <w:right w:w="100" w:type="dxa"/>
                       </w:tblCellMar>
                     </w:tblPrEx>
@@ -9139,7 +9181,7 @@
                         <w:pPr>
                           <w:keepNext/>
                           <w:keepLines/>
-                          <w:spacing w:beforeLines="50" w:after="80" w:line="240" w:lineRule="auto"/>
+                          <w:spacing w:beforeLines="50" w:after="40" w:line="240" w:lineRule="auto"/>
                           <w:jc w:val="left"/>
                           <w:rPr>
                             <w:rFonts w:hint="default" w:ascii="Times New Roman" w:hAnsi="Times New Roman" w:eastAsia="宋体" w:cs="Times New Roman"/>
@@ -9177,7 +9219,7 @@
                         <w:pPr>
                           <w:keepNext/>
                           <w:keepLines/>
-                          <w:spacing w:beforeLines="50" w:after="80" w:line="240" w:lineRule="auto"/>
+                          <w:spacing w:beforeLines="50" w:after="40" w:line="240" w:lineRule="auto"/>
                           <w:jc w:val="left"/>
                           <w:rPr>
                             <w:rFonts w:hint="default" w:ascii="Times New Roman" w:hAnsi="Times New Roman" w:eastAsia="宋体" w:cs="Times New Roman"/>
@@ -9215,7 +9257,7 @@
                         <w:pPr>
                           <w:keepNext/>
                           <w:keepLines/>
-                          <w:spacing w:beforeLines="50" w:after="80" w:line="240" w:lineRule="auto"/>
+                          <w:spacing w:beforeLines="50" w:after="40" w:line="240" w:lineRule="auto"/>
                           <w:jc w:val="left"/>
                           <w:rPr>
                             <w:rFonts w:hint="default" w:ascii="Times New Roman" w:hAnsi="Times New Roman" w:eastAsia="宋体" w:cs="Times New Roman"/>
@@ -9251,9 +9293,9 @@
                         <w:insideV w:val="single" w:color="D9D9D9" w:sz="2" w:space="0"/>
                       </w:tblBorders>
                       <w:tblCellMar>
-                        <w:top w:w="100" w:type="dxa"/>
+                        <w:top w:w="60" w:type="dxa"/>
                         <w:left w:w="100" w:type="dxa"/>
-                        <w:bottom w:w="100" w:type="dxa"/>
+                        <w:bottom w:w="60" w:type="dxa"/>
                         <w:right w:w="100" w:type="dxa"/>
                       </w:tblCellMar>
                     </w:tblPrEx>
@@ -9274,7 +9316,7 @@
                         <w:pPr>
                           <w:keepNext/>
                           <w:keepLines/>
-                          <w:spacing w:beforeLines="50" w:after="80" w:line="240" w:lineRule="auto"/>
+                          <w:spacing w:beforeLines="50" w:after="40" w:line="240" w:lineRule="auto"/>
                           <w:jc w:val="left"/>
                           <w:rPr>
                             <w:rFonts w:hint="default" w:ascii="Times New Roman" w:hAnsi="Times New Roman" w:eastAsia="宋体" w:cs="Times New Roman"/>
@@ -9312,7 +9354,7 @@
                         <w:pPr>
                           <w:keepNext/>
                           <w:keepLines/>
-                          <w:spacing w:beforeLines="50" w:after="80" w:line="240" w:lineRule="auto"/>
+                          <w:spacing w:beforeLines="50" w:after="40" w:line="240" w:lineRule="auto"/>
                           <w:jc w:val="left"/>
                           <w:rPr>
                             <w:rFonts w:hint="default" w:ascii="Times New Roman" w:hAnsi="Times New Roman" w:eastAsia="宋体" w:cs="Times New Roman"/>
@@ -9350,7 +9392,7 @@
                         <w:pPr>
                           <w:keepNext/>
                           <w:keepLines/>
-                          <w:spacing w:beforeLines="50" w:after="80" w:line="240" w:lineRule="auto"/>
+                          <w:spacing w:beforeLines="50" w:after="40" w:line="240" w:lineRule="auto"/>
                           <w:jc w:val="left"/>
                           <w:rPr>
                             <w:rFonts w:hint="default" w:ascii="Times New Roman" w:hAnsi="Times New Roman" w:eastAsia="宋体" w:cs="Times New Roman"/>
@@ -9386,9 +9428,9 @@
                         <w:insideV w:val="single" w:color="D9D9D9" w:sz="2" w:space="0"/>
                       </w:tblBorders>
                       <w:tblCellMar>
-                        <w:top w:w="100" w:type="dxa"/>
+                        <w:top w:w="60" w:type="dxa"/>
                         <w:left w:w="100" w:type="dxa"/>
-                        <w:bottom w:w="100" w:type="dxa"/>
+                        <w:bottom w:w="60" w:type="dxa"/>
                         <w:right w:w="100" w:type="dxa"/>
                       </w:tblCellMar>
                     </w:tblPrEx>
@@ -9409,7 +9451,7 @@
                         <w:pPr>
                           <w:keepNext/>
                           <w:keepLines/>
-                          <w:spacing w:beforeLines="50" w:after="80" w:line="240" w:lineRule="auto"/>
+                          <w:spacing w:beforeLines="50" w:after="40" w:line="240" w:lineRule="auto"/>
                           <w:jc w:val="left"/>
                           <w:rPr>
                             <w:rFonts w:hint="default" w:ascii="Times New Roman" w:hAnsi="Times New Roman" w:eastAsia="宋体" w:cs="Times New Roman"/>
@@ -9447,7 +9489,7 @@
                         <w:pPr>
                           <w:keepNext/>
                           <w:keepLines/>
-                          <w:spacing w:beforeLines="50" w:after="80" w:line="240" w:lineRule="auto"/>
+                          <w:spacing w:beforeLines="50" w:after="40" w:line="240" w:lineRule="auto"/>
                           <w:jc w:val="left"/>
                           <w:rPr>
                             <w:rFonts w:hint="default" w:ascii="Times New Roman" w:hAnsi="Times New Roman" w:eastAsia="宋体" w:cs="Times New Roman"/>
@@ -9485,7 +9527,7 @@
                         <w:pPr>
                           <w:keepNext/>
                           <w:keepLines/>
-                          <w:spacing w:beforeLines="50" w:after="80" w:line="240" w:lineRule="auto"/>
+                          <w:spacing w:beforeLines="50" w:after="40" w:line="240" w:lineRule="auto"/>
                           <w:jc w:val="left"/>
                           <w:rPr>
                             <w:rFonts w:hint="default" w:ascii="Times New Roman" w:hAnsi="Times New Roman" w:eastAsia="宋体" w:cs="Times New Roman"/>
@@ -9521,9 +9563,9 @@
                         <w:insideV w:val="single" w:color="D9D9D9" w:sz="2" w:space="0"/>
                       </w:tblBorders>
                       <w:tblCellMar>
-                        <w:top w:w="100" w:type="dxa"/>
+                        <w:top w:w="60" w:type="dxa"/>
                         <w:left w:w="100" w:type="dxa"/>
-                        <w:bottom w:w="100" w:type="dxa"/>
+                        <w:bottom w:w="60" w:type="dxa"/>
                         <w:right w:w="100" w:type="dxa"/>
                       </w:tblCellMar>
                     </w:tblPrEx>
@@ -9544,7 +9586,7 @@
                         <w:pPr>
                           <w:keepNext w:val="0"/>
                           <w:keepLines/>
-                          <w:spacing w:beforeLines="50" w:after="80" w:line="240" w:lineRule="auto"/>
+                          <w:spacing w:beforeLines="50" w:after="40" w:line="240" w:lineRule="auto"/>
                           <w:jc w:val="left"/>
                           <w:rPr>
                             <w:rFonts w:hint="default" w:ascii="Times New Roman" w:hAnsi="Times New Roman" w:eastAsia="宋体" w:cs="Times New Roman"/>
@@ -9582,7 +9624,7 @@
                         <w:pPr>
                           <w:keepNext w:val="0"/>
                           <w:keepLines/>
-                          <w:spacing w:beforeLines="50" w:after="80" w:line="240" w:lineRule="auto"/>
+                          <w:spacing w:beforeLines="50" w:after="40" w:line="240" w:lineRule="auto"/>
                           <w:jc w:val="left"/>
                           <w:rPr>
                             <w:rFonts w:hint="default" w:ascii="Times New Roman" w:hAnsi="Times New Roman" w:eastAsia="宋体" w:cs="Times New Roman"/>
@@ -9620,7 +9662,7 @@
                         <w:pPr>
                           <w:keepNext w:val="0"/>
                           <w:keepLines/>
-                          <w:spacing w:beforeLines="50" w:after="80" w:line="240" w:lineRule="auto"/>
+                          <w:spacing w:beforeLines="50" w:after="40" w:line="240" w:lineRule="auto"/>
                           <w:jc w:val="left"/>
                           <w:rPr>
                             <w:rFonts w:hint="default" w:ascii="Times New Roman" w:hAnsi="Times New Roman" w:eastAsia="宋体" w:cs="Times New Roman"/>
@@ -9806,7 +9848,7 @@
                 <w:szCs w:val="28"/>
                 <w:lang w:val="en-US" w:eastAsia="zh-CN"/>
               </w:rPr>
-              <w:t>已形成文献和制度分析、等效模型、合成试验程序、国内候选器件核对及离线网站。当前基础属于方案、模型和软件，尚无硬件台架、真实无线、整机功耗或田间性能数据。图12为程序保存结果生成的模型检验图，用于说明可行条件与失败趋势。</w:t>
+              <w:t>已形成文献和制度分析、等效模型、合成试验程序、国内候选器件核对及离线网站。当前基础属于方案、模型和软件，尚无硬件台架、真实无线、整机功耗或田间性能数据。图9为程序保存结果生成的模型检验图，用于说明可行条件与失败趋势。</w:t>
             </w:r>
           </w:p>
           <w:p>
@@ -9834,11 +9876,11 @@
                 <w:lang w:val="en-US" w:eastAsia="zh-CN"/>
               </w:rPr>
               <w:pict>
-                <v:shape id="_x0000_i1037" o:spt="75" alt="图12 渐进故障及噪声影响的合成模型检验 参数未标定" type="#_x0000_t75" style="height:405.5pt;width:425pt;" filled="f" o:preferrelative="t" stroked="f" coordsize="21600,21600">
+                <v:shape id="_x0000_i1034" o:spt="75" alt="图9 渐进故障及噪声影响的合成模型检验 参数未标定" type="#_x0000_t75" style="height:417.2pt;width:425pt;" filled="f" o:preferrelative="t" stroked="f" coordsize="21600,21600">
                   <v:path/>
                   <v:fill on="f" focussize="0,0"/>
                   <v:stroke on="f"/>
-                  <v:imagedata r:id="rId17" o:title="early_diagnosis"/>
+                  <v:imagedata r:id="rId14" o:title="early_diagnosis"/>
                   <o:lock v:ext="edit" aspectratio="t"/>
                   <w10:wrap type="none"/>
                   <w10:anchorlock/>
@@ -9861,7 +9903,7 @@
                 <w:szCs w:val="28"/>
                 <w:lang w:val="en-US" w:eastAsia="zh-CN"/>
               </w:rPr>
-              <w:t>图12 渐进故障及噪声影响的合成模型检验 参数未标定</w:t>
+              <w:t>图9 渐进故障及噪声影响的合成模型检验 参数未标定</w:t>
             </w:r>
           </w:p>
           <w:p>
@@ -9888,7 +9930,7 @@
                 <w:szCs w:val="28"/>
                 <w:lang w:val="en-US" w:eastAsia="zh-CN"/>
               </w:rPr>
-              <w:t>双压力模型完成6场景×4压力噪声×20种子共480次试验。在理想同步、平方律及单故障条件下，低噪声时两类故障各20/20试次在15%演示判据前正确提示且无前期误报；噪声σ=10kPa时均降为12/20。种子10300、σ=0.3kPa的单次示例中，泄漏提示409秒、判据485秒，提前76秒；受限提示396秒、判据522秒，提前126秒。统计与单次示例分别陈述，不作为实物性能。</w:t>
+              <w:t>已完成6场景×4压力噪声×20种子的480次双压力合成试验。理想同步、平方律及单故障假设下，低噪声两类各20/20在15%演示参照前正确提示，且无前期误报；σ=10kPa时各降为12/20。种子10300、σ=0.3kPa示例中，泄漏提示/参照为409/485秒（提前76秒），受限为396/522秒（提前126秒）。种子统计与单次示例分列，均非实物性能。</w:t>
             </w:r>
           </w:p>
           <w:p>
@@ -9915,9 +9957,95 @@
                 <w:szCs w:val="28"/>
                 <w:lang w:val="en-US" w:eastAsia="zh-CN"/>
               </w:rPr>
-              <w:t>反例显示压力漂移会引发误报，未知正常负载与等效泄漏可具有同样观测。旧单压力模型的12类挑战共240个合成试次也发现弱异常漏检及原因歧义。上述结果支持增加标定、状态信息和不确定性输出，并不支持通用辨因结论。</w:t>
-            </w:r>
-          </w:p>
+              <w:t>反例中压力漂移会误报，未知正常负载与泄漏同形。旧单压力模型12类挑战、240次合成也出现弱异常漏检及原因歧义。因此需标定、状态信息与有限输出，不能据此宣称通用辨因。</w:t>
+            </w:r>
+          </w:p>
+          <w:tbl>
+            <w:tblPr>
+              <w:tblStyle w:val="6"/>
+              <w:tblW w:w="9100" w:type="dxa"/>
+              <w:tblInd w:w="5" w:type="dxa"/>
+              <w:tblBorders>
+                <w:top w:val="none" w:color="auto" w:sz="0" w:space="0"/>
+                <w:left w:val="none" w:color="auto" w:sz="0" w:space="0"/>
+                <w:bottom w:val="none" w:color="auto" w:sz="0" w:space="0"/>
+                <w:right w:val="none" w:color="auto" w:sz="0" w:space="0"/>
+                <w:insideH w:val="none" w:color="auto" w:sz="0" w:space="0"/>
+                <w:insideV w:val="none" w:color="auto" w:sz="0" w:space="0"/>
+              </w:tblBorders>
+              <w:tblLayout w:type="fixed"/>
+              <w:tblCellMar>
+                <w:top w:w="0" w:type="dxa"/>
+                <w:left w:w="0" w:type="dxa"/>
+                <w:bottom w:w="0" w:type="dxa"/>
+                <w:right w:w="0" w:type="dxa"/>
+              </w:tblCellMar>
+            </w:tblPr>
+            <w:tblGrid>
+              <w:gridCol w:w="9100"/>
+            </w:tblGrid>
+            <w:tr>
+              <w:tblPrEx>
+                <w:tblBorders>
+                  <w:top w:val="none" w:color="auto" w:sz="0" w:space="0"/>
+                  <w:left w:val="none" w:color="auto" w:sz="0" w:space="0"/>
+                  <w:bottom w:val="none" w:color="auto" w:sz="0" w:space="0"/>
+                  <w:right w:val="none" w:color="auto" w:sz="0" w:space="0"/>
+                  <w:insideH w:val="none" w:color="auto" w:sz="0" w:space="0"/>
+                  <w:insideV w:val="none" w:color="auto" w:sz="0" w:space="0"/>
+                </w:tblBorders>
+                <w:tblCellMar>
+                  <w:top w:w="0" w:type="dxa"/>
+                  <w:left w:w="0" w:type="dxa"/>
+                  <w:bottom w:w="0" w:type="dxa"/>
+                  <w:right w:w="0" w:type="dxa"/>
+                </w:tblCellMar>
+              </w:tblPrEx>
+              <w:trPr>
+                <w:cantSplit/>
+              </w:trPr>
+              <w:tc>
+                <w:tcPr>
+                  <w:tcW w:w="9100" w:type="dxa"/>
+                  <w:tcBorders>
+                    <w:tl2br w:val="nil"/>
+                    <w:tr2bl w:val="nil"/>
+                  </w:tcBorders>
+                </w:tcPr>
+                <w:p>
+                  <w:pPr>
+                    <w:keepNext w:val="0"/>
+                    <w:keepLines/>
+                    <w:pageBreakBefore w:val="0"/>
+                    <w:numPr>
+                      <w:ilvl w:val="0"/>
+                      <w:numId w:val="0"/>
+                    </w:numPr>
+                    <w:spacing w:beforeLines="50" w:after="100" w:line="240" w:lineRule="auto"/>
+                    <w:jc w:val="left"/>
+                    <w:rPr>
+                      <w:rFonts w:hint="default" w:ascii="Times New Roman" w:hAnsi="Times New Roman" w:eastAsia="宋体" w:cs="Times New Roman"/>
+                      <w:sz w:val="21"/>
+                      <w:szCs w:val="28"/>
+                      <w:vertAlign w:val="baseline"/>
+                      <w:lang w:val="en-US" w:eastAsia="zh-CN"/>
+                    </w:rPr>
+                  </w:pPr>
+                  <w:r>
+                    <w:rPr>
+                      <w:rFonts w:hint="default" w:ascii="Times New Roman" w:hAnsi="Times New Roman" w:eastAsia="宋体" w:cs="Times New Roman"/>
+                      <w:b w:val="0"/>
+                      <w:sz w:val="21"/>
+                      <w:szCs w:val="28"/>
+                      <w:vertAlign w:val="baseline"/>
+                      <w:lang w:val="en-US" w:eastAsia="zh-CN"/>
+                    </w:rPr>
+                    <w:t>已完成1920次公平通信回放，统一检测器、载荷、缓存、ACK与去重。慢周期具有竞争力，噪声可增加事件发送；尚无完整射频和整机能量测量。诊断与通信分开验证，联合实物系统拟在实施期完成。</w:t>
+                  </w:r>
+                </w:p>
+              </w:tc>
+            </w:tr>
+          </w:tbl>
           <w:p>
             <w:pPr>
               <w:keepNext w:val="0"/>
@@ -9935,15 +10063,6 @@
                 <w:lang w:val="en-US" w:eastAsia="zh-CN"/>
               </w:rPr>
             </w:pPr>
-            <w:r>
-              <w:rPr>
-                <w:rFonts w:hint="default" w:ascii="Times New Roman" w:hAnsi="Times New Roman" w:eastAsia="宋体" w:cs="Times New Roman"/>
-                <w:sz w:val="21"/>
-                <w:szCs w:val="28"/>
-                <w:lang w:val="en-US" w:eastAsia="zh-CN"/>
-              </w:rPr>
-              <w:t>公平通信回放完成1920次，同一检测器和载荷下统一缓存、ACK及去重，显示慢周期具有竞争力，噪声可增加事件发送；未模拟完整射频或整机能量。诊断与通信仍为分别验证的模型，真实联合系统拟在实施期完成。</w:t>
-            </w:r>
           </w:p>
           <w:p>
             <w:pPr>
@@ -9969,7 +10088,7 @@
                 <w:szCs w:val="28"/>
                 <w:lang w:val="en-US" w:eastAsia="zh-CN"/>
               </w:rPr>
-              <w:t>程序、JSON/CSV和图表可追溯，图10是当前离线网页实际截图，支持合成回放、质量状态及确认演示；实际设备接入与日志持久化尚未实现。目前没有已发表论文、授权专利、软著或田间成绩。</w:t>
+              <w:t>程序、JSON/CSV和图表可追溯，图8是当前离线网页实际截图，支持合成回放、质量状态及确认演示；实际设备接入与日志持久化尚未实现。目前没有已发表论文、授权专利、软著或田间成绩。</w:t>
             </w:r>
           </w:p>
           <w:p>
@@ -10160,6 +10279,12 @@
                   <w:insideH w:val="none" w:color="auto" w:sz="0" w:space="0"/>
                   <w:insideV w:val="none" w:color="auto" w:sz="0" w:space="0"/>
                 </w:tblBorders>
+                <w:tblCellMar>
+                  <w:top w:w="0" w:type="dxa"/>
+                  <w:left w:w="0" w:type="dxa"/>
+                  <w:bottom w:w="0" w:type="dxa"/>
+                  <w:right w:w="0" w:type="dxa"/>
+                </w:tblCellMar>
               </w:tblPrEx>
               <w:trPr>
                 <w:cantSplit/>
@@ -10214,9 +10339,9 @@
                     </w:tblBorders>
                     <w:tblLayout w:type="fixed"/>
                     <w:tblCellMar>
-                      <w:top w:w="100" w:type="dxa"/>
+                      <w:top w:w="60" w:type="dxa"/>
                       <w:left w:w="100" w:type="dxa"/>
-                      <w:bottom w:w="100" w:type="dxa"/>
+                      <w:bottom w:w="60" w:type="dxa"/>
                       <w:right w:w="100" w:type="dxa"/>
                     </w:tblCellMar>
                   </w:tblPr>
@@ -10236,9 +10361,9 @@
                         <w:insideV w:val="single" w:color="D9D9D9" w:sz="2" w:space="0"/>
                       </w:tblBorders>
                       <w:tblCellMar>
-                        <w:top w:w="100" w:type="dxa"/>
+                        <w:top w:w="60" w:type="dxa"/>
                         <w:left w:w="100" w:type="dxa"/>
-                        <w:bottom w:w="100" w:type="dxa"/>
+                        <w:bottom w:w="60" w:type="dxa"/>
                         <w:right w:w="100" w:type="dxa"/>
                       </w:tblCellMar>
                     </w:tblPrEx>
@@ -10260,7 +10385,7 @@
                         <w:pPr>
                           <w:keepNext/>
                           <w:keepLines/>
-                          <w:spacing w:beforeLines="50" w:after="80" w:line="240" w:lineRule="auto"/>
+                          <w:spacing w:beforeLines="50" w:after="40" w:line="240" w:lineRule="auto"/>
                           <w:jc w:val="left"/>
                           <w:rPr>
                             <w:rFonts w:hint="default" w:ascii="Times New Roman" w:hAnsi="Times New Roman" w:eastAsia="宋体" w:cs="Times New Roman"/>
@@ -10298,7 +10423,7 @@
                         <w:pPr>
                           <w:keepNext/>
                           <w:keepLines/>
-                          <w:spacing w:beforeLines="50" w:after="80" w:line="240" w:lineRule="auto"/>
+                          <w:spacing w:beforeLines="50" w:after="40" w:line="240" w:lineRule="auto"/>
                           <w:jc w:val="left"/>
                           <w:rPr>
                             <w:rFonts w:hint="default" w:ascii="Times New Roman" w:hAnsi="Times New Roman" w:eastAsia="宋体" w:cs="Times New Roman"/>
@@ -10336,7 +10461,7 @@
                         <w:pPr>
                           <w:keepNext/>
                           <w:keepLines/>
-                          <w:spacing w:beforeLines="50" w:after="80" w:line="240" w:lineRule="auto"/>
+                          <w:spacing w:beforeLines="50" w:after="40" w:line="240" w:lineRule="auto"/>
                           <w:jc w:val="left"/>
                           <w:rPr>
                             <w:rFonts w:hint="default" w:ascii="Times New Roman" w:hAnsi="Times New Roman" w:eastAsia="宋体" w:cs="Times New Roman"/>
@@ -10372,9 +10497,9 @@
                         <w:insideV w:val="single" w:color="D9D9D9" w:sz="2" w:space="0"/>
                       </w:tblBorders>
                       <w:tblCellMar>
-                        <w:top w:w="100" w:type="dxa"/>
+                        <w:top w:w="60" w:type="dxa"/>
                         <w:left w:w="100" w:type="dxa"/>
-                        <w:bottom w:w="100" w:type="dxa"/>
+                        <w:bottom w:w="60" w:type="dxa"/>
                         <w:right w:w="100" w:type="dxa"/>
                       </w:tblCellMar>
                     </w:tblPrEx>
@@ -10395,7 +10520,7 @@
                         <w:pPr>
                           <w:keepNext/>
                           <w:keepLines/>
-                          <w:spacing w:beforeLines="50" w:after="80" w:line="240" w:lineRule="auto"/>
+                          <w:spacing w:beforeLines="50" w:after="40" w:line="240" w:lineRule="auto"/>
                           <w:jc w:val="left"/>
                           <w:rPr>
                             <w:rFonts w:hint="default" w:ascii="Times New Roman" w:hAnsi="Times New Roman" w:eastAsia="宋体" w:cs="Times New Roman"/>
@@ -10433,7 +10558,7 @@
                         <w:pPr>
                           <w:keepNext/>
                           <w:keepLines/>
-                          <w:spacing w:beforeLines="50" w:after="80" w:line="240" w:lineRule="auto"/>
+                          <w:spacing w:beforeLines="50" w:after="40" w:line="240" w:lineRule="auto"/>
                           <w:jc w:val="left"/>
                           <w:rPr>
                             <w:rFonts w:hint="default" w:ascii="Times New Roman" w:hAnsi="Times New Roman" w:eastAsia="宋体" w:cs="Times New Roman"/>
@@ -10471,7 +10596,7 @@
                         <w:pPr>
                           <w:keepNext/>
                           <w:keepLines/>
-                          <w:spacing w:beforeLines="50" w:after="80" w:line="240" w:lineRule="auto"/>
+                          <w:spacing w:beforeLines="50" w:after="40" w:line="240" w:lineRule="auto"/>
                           <w:jc w:val="left"/>
                           <w:rPr>
                             <w:rFonts w:hint="default" w:ascii="Times New Roman" w:hAnsi="Times New Roman" w:eastAsia="宋体" w:cs="Times New Roman"/>
@@ -10507,9 +10632,9 @@
                         <w:insideV w:val="single" w:color="D9D9D9" w:sz="2" w:space="0"/>
                       </w:tblBorders>
                       <w:tblCellMar>
-                        <w:top w:w="100" w:type="dxa"/>
+                        <w:top w:w="60" w:type="dxa"/>
                         <w:left w:w="100" w:type="dxa"/>
-                        <w:bottom w:w="100" w:type="dxa"/>
+                        <w:bottom w:w="60" w:type="dxa"/>
                         <w:right w:w="100" w:type="dxa"/>
                       </w:tblCellMar>
                     </w:tblPrEx>
@@ -10530,7 +10655,7 @@
                         <w:pPr>
                           <w:keepNext/>
                           <w:keepLines/>
-                          <w:spacing w:beforeLines="50" w:after="80" w:line="240" w:lineRule="auto"/>
+                          <w:spacing w:beforeLines="50" w:after="40" w:line="240" w:lineRule="auto"/>
                           <w:jc w:val="left"/>
                           <w:rPr>
                             <w:rFonts w:hint="default" w:ascii="Times New Roman" w:hAnsi="Times New Roman" w:eastAsia="宋体" w:cs="Times New Roman"/>
@@ -10568,7 +10693,7 @@
                         <w:pPr>
                           <w:keepNext/>
                           <w:keepLines/>
-                          <w:spacing w:beforeLines="50" w:after="80" w:line="240" w:lineRule="auto"/>
+                          <w:spacing w:beforeLines="50" w:after="40" w:line="240" w:lineRule="auto"/>
                           <w:jc w:val="left"/>
                           <w:rPr>
                             <w:rFonts w:hint="default" w:ascii="Times New Roman" w:hAnsi="Times New Roman" w:eastAsia="宋体" w:cs="Times New Roman"/>
@@ -10606,7 +10731,7 @@
                         <w:pPr>
                           <w:keepNext/>
                           <w:keepLines/>
-                          <w:spacing w:beforeLines="50" w:after="80" w:line="240" w:lineRule="auto"/>
+                          <w:spacing w:beforeLines="50" w:after="40" w:line="240" w:lineRule="auto"/>
                           <w:jc w:val="left"/>
                           <w:rPr>
                             <w:rFonts w:hint="default" w:ascii="Times New Roman" w:hAnsi="Times New Roman" w:eastAsia="宋体" w:cs="Times New Roman"/>
@@ -10642,9 +10767,9 @@
                         <w:insideV w:val="single" w:color="D9D9D9" w:sz="2" w:space="0"/>
                       </w:tblBorders>
                       <w:tblCellMar>
-                        <w:top w:w="100" w:type="dxa"/>
+                        <w:top w:w="60" w:type="dxa"/>
                         <w:left w:w="100" w:type="dxa"/>
-                        <w:bottom w:w="100" w:type="dxa"/>
+                        <w:bottom w:w="60" w:type="dxa"/>
                         <w:right w:w="100" w:type="dxa"/>
                       </w:tblCellMar>
                     </w:tblPrEx>
@@ -10665,7 +10790,7 @@
                         <w:pPr>
                           <w:keepNext/>
                           <w:keepLines/>
-                          <w:spacing w:beforeLines="50" w:after="80" w:line="240" w:lineRule="auto"/>
+                          <w:spacing w:beforeLines="50" w:after="40" w:line="240" w:lineRule="auto"/>
                           <w:jc w:val="left"/>
                           <w:rPr>
                             <w:rFonts w:hint="default" w:ascii="Times New Roman" w:hAnsi="Times New Roman" w:eastAsia="宋体" w:cs="Times New Roman"/>
@@ -10703,7 +10828,7 @@
                         <w:pPr>
                           <w:keepNext/>
                           <w:keepLines/>
-                          <w:spacing w:beforeLines="50" w:after="80" w:line="240" w:lineRule="auto"/>
+                          <w:spacing w:beforeLines="50" w:after="40" w:line="240" w:lineRule="auto"/>
                           <w:jc w:val="left"/>
                           <w:rPr>
                             <w:rFonts w:hint="default" w:ascii="Times New Roman" w:hAnsi="Times New Roman" w:eastAsia="宋体" w:cs="Times New Roman"/>
@@ -10741,7 +10866,7 @@
                         <w:pPr>
                           <w:keepNext/>
                           <w:keepLines/>
-                          <w:spacing w:beforeLines="50" w:after="80" w:line="240" w:lineRule="auto"/>
+                          <w:spacing w:beforeLines="50" w:after="40" w:line="240" w:lineRule="auto"/>
                           <w:jc w:val="left"/>
                           <w:rPr>
                             <w:rFonts w:hint="default" w:ascii="Times New Roman" w:hAnsi="Times New Roman" w:eastAsia="宋体" w:cs="Times New Roman"/>
@@ -10777,9 +10902,9 @@
                         <w:insideV w:val="single" w:color="D9D9D9" w:sz="2" w:space="0"/>
                       </w:tblBorders>
                       <w:tblCellMar>
-                        <w:top w:w="100" w:type="dxa"/>
+                        <w:top w:w="60" w:type="dxa"/>
                         <w:left w:w="100" w:type="dxa"/>
-                        <w:bottom w:w="100" w:type="dxa"/>
+                        <w:bottom w:w="60" w:type="dxa"/>
                         <w:right w:w="100" w:type="dxa"/>
                       </w:tblCellMar>
                     </w:tblPrEx>
@@ -10800,7 +10925,7 @@
                         <w:pPr>
                           <w:keepNext/>
                           <w:keepLines/>
-                          <w:spacing w:beforeLines="50" w:after="80" w:line="240" w:lineRule="auto"/>
+                          <w:spacing w:beforeLines="50" w:after="40" w:line="240" w:lineRule="auto"/>
                           <w:jc w:val="left"/>
                           <w:rPr>
                             <w:rFonts w:hint="default" w:ascii="Times New Roman" w:hAnsi="Times New Roman" w:eastAsia="宋体" w:cs="Times New Roman"/>
@@ -10838,7 +10963,7 @@
                         <w:pPr>
                           <w:keepNext/>
                           <w:keepLines/>
-                          <w:spacing w:beforeLines="50" w:after="80" w:line="240" w:lineRule="auto"/>
+                          <w:spacing w:beforeLines="50" w:after="40" w:line="240" w:lineRule="auto"/>
                           <w:jc w:val="left"/>
                           <w:rPr>
                             <w:rFonts w:hint="default" w:ascii="Times New Roman" w:hAnsi="Times New Roman" w:eastAsia="宋体" w:cs="Times New Roman"/>
@@ -10876,7 +11001,7 @@
                         <w:pPr>
                           <w:keepNext/>
                           <w:keepLines/>
-                          <w:spacing w:beforeLines="50" w:after="80" w:line="240" w:lineRule="auto"/>
+                          <w:spacing w:beforeLines="50" w:after="40" w:line="240" w:lineRule="auto"/>
                           <w:jc w:val="left"/>
                           <w:rPr>
                             <w:rFonts w:hint="default" w:ascii="Times New Roman" w:hAnsi="Times New Roman" w:eastAsia="宋体" w:cs="Times New Roman"/>
@@ -10912,9 +11037,9 @@
                         <w:insideV w:val="single" w:color="D9D9D9" w:sz="2" w:space="0"/>
                       </w:tblBorders>
                       <w:tblCellMar>
-                        <w:top w:w="100" w:type="dxa"/>
+                        <w:top w:w="60" w:type="dxa"/>
                         <w:left w:w="100" w:type="dxa"/>
-                        <w:bottom w:w="100" w:type="dxa"/>
+                        <w:bottom w:w="60" w:type="dxa"/>
                         <w:right w:w="100" w:type="dxa"/>
                       </w:tblCellMar>
                     </w:tblPrEx>
@@ -10935,7 +11060,7 @@
                         <w:pPr>
                           <w:keepNext/>
                           <w:keepLines/>
-                          <w:spacing w:beforeLines="50" w:after="80" w:line="240" w:lineRule="auto"/>
+                          <w:spacing w:beforeLines="50" w:after="40" w:line="240" w:lineRule="auto"/>
                           <w:jc w:val="left"/>
                           <w:rPr>
                             <w:rFonts w:hint="default" w:ascii="Times New Roman" w:hAnsi="Times New Roman" w:eastAsia="宋体" w:cs="Times New Roman"/>
@@ -10973,7 +11098,7 @@
                         <w:pPr>
                           <w:keepNext/>
                           <w:keepLines/>
-                          <w:spacing w:beforeLines="50" w:after="80" w:line="240" w:lineRule="auto"/>
+                          <w:spacing w:beforeLines="50" w:after="40" w:line="240" w:lineRule="auto"/>
                           <w:jc w:val="left"/>
                           <w:rPr>
                             <w:rFonts w:hint="default" w:ascii="Times New Roman" w:hAnsi="Times New Roman" w:eastAsia="宋体" w:cs="Times New Roman"/>
@@ -11011,7 +11136,7 @@
                         <w:pPr>
                           <w:keepNext/>
                           <w:keepLines/>
-                          <w:spacing w:beforeLines="50" w:after="80" w:line="240" w:lineRule="auto"/>
+                          <w:spacing w:beforeLines="50" w:after="40" w:line="240" w:lineRule="auto"/>
                           <w:jc w:val="left"/>
                           <w:rPr>
                             <w:rFonts w:hint="default" w:ascii="Times New Roman" w:hAnsi="Times New Roman" w:eastAsia="宋体" w:cs="Times New Roman"/>
@@ -11047,9 +11172,9 @@
                         <w:insideV w:val="single" w:color="D9D9D9" w:sz="2" w:space="0"/>
                       </w:tblBorders>
                       <w:tblCellMar>
-                        <w:top w:w="100" w:type="dxa"/>
+                        <w:top w:w="60" w:type="dxa"/>
                         <w:left w:w="100" w:type="dxa"/>
-                        <w:bottom w:w="100" w:type="dxa"/>
+                        <w:bottom w:w="60" w:type="dxa"/>
                         <w:right w:w="100" w:type="dxa"/>
                       </w:tblCellMar>
                     </w:tblPrEx>
@@ -11070,7 +11195,7 @@
                         <w:pPr>
                           <w:keepNext/>
                           <w:keepLines/>
-                          <w:spacing w:beforeLines="50" w:after="80" w:line="240" w:lineRule="auto"/>
+                          <w:spacing w:beforeLines="50" w:after="40" w:line="240" w:lineRule="auto"/>
                           <w:jc w:val="left"/>
                           <w:rPr>
                             <w:rFonts w:hint="default" w:ascii="Times New Roman" w:hAnsi="Times New Roman" w:eastAsia="宋体" w:cs="Times New Roman"/>
@@ -11108,7 +11233,7 @@
                         <w:pPr>
                           <w:keepNext/>
                           <w:keepLines/>
-                          <w:spacing w:beforeLines="50" w:after="80" w:line="240" w:lineRule="auto"/>
+                          <w:spacing w:beforeLines="50" w:after="40" w:line="240" w:lineRule="auto"/>
                           <w:jc w:val="left"/>
                           <w:rPr>
                             <w:rFonts w:hint="default" w:ascii="Times New Roman" w:hAnsi="Times New Roman" w:eastAsia="宋体" w:cs="Times New Roman"/>
@@ -11146,7 +11271,7 @@
                         <w:pPr>
                           <w:keepNext/>
                           <w:keepLines/>
-                          <w:spacing w:beforeLines="50" w:after="80" w:line="240" w:lineRule="auto"/>
+                          <w:spacing w:beforeLines="50" w:after="40" w:line="240" w:lineRule="auto"/>
                           <w:jc w:val="left"/>
                           <w:rPr>
                             <w:rFonts w:hint="default" w:ascii="Times New Roman" w:hAnsi="Times New Roman" w:eastAsia="宋体" w:cs="Times New Roman"/>
@@ -11182,9 +11307,9 @@
                         <w:insideV w:val="single" w:color="D9D9D9" w:sz="2" w:space="0"/>
                       </w:tblBorders>
                       <w:tblCellMar>
-                        <w:top w:w="100" w:type="dxa"/>
+                        <w:top w:w="60" w:type="dxa"/>
                         <w:left w:w="100" w:type="dxa"/>
-                        <w:bottom w:w="100" w:type="dxa"/>
+                        <w:bottom w:w="60" w:type="dxa"/>
                         <w:right w:w="100" w:type="dxa"/>
                       </w:tblCellMar>
                     </w:tblPrEx>
@@ -11205,7 +11330,7 @@
                         <w:pPr>
                           <w:keepNext w:val="0"/>
                           <w:keepLines/>
-                          <w:spacing w:beforeLines="50" w:after="80" w:line="240" w:lineRule="auto"/>
+                          <w:spacing w:beforeLines="50" w:after="40" w:line="240" w:lineRule="auto"/>
                           <w:jc w:val="left"/>
                           <w:rPr>
                             <w:rFonts w:hint="default" w:ascii="Times New Roman" w:hAnsi="Times New Roman" w:eastAsia="宋体" w:cs="Times New Roman"/>
@@ -11243,7 +11368,7 @@
                         <w:pPr>
                           <w:keepNext w:val="0"/>
                           <w:keepLines/>
-                          <w:spacing w:beforeLines="50" w:after="80" w:line="240" w:lineRule="auto"/>
+                          <w:spacing w:beforeLines="50" w:after="40" w:line="240" w:lineRule="auto"/>
                           <w:jc w:val="left"/>
                           <w:rPr>
                             <w:rFonts w:hint="default" w:ascii="Times New Roman" w:hAnsi="Times New Roman" w:eastAsia="宋体" w:cs="Times New Roman"/>
@@ -11281,7 +11406,7 @@
                         <w:pPr>
                           <w:keepNext w:val="0"/>
                           <w:keepLines/>
-                          <w:spacing w:beforeLines="50" w:after="80" w:line="240" w:lineRule="auto"/>
+                          <w:spacing w:beforeLines="50" w:after="40" w:line="240" w:lineRule="auto"/>
                           <w:jc w:val="left"/>
                           <w:rPr>
                             <w:rFonts w:hint="default" w:ascii="Times New Roman" w:hAnsi="Times New Roman" w:eastAsia="宋体" w:cs="Times New Roman"/>
@@ -11359,7 +11484,7 @@
                 <w:szCs w:val="28"/>
                 <w:lang w:val="en-US" w:eastAsia="zh-CN"/>
               </w:rPr>
-              <w:t>预算以已有电脑、可借参考仪器及可调连续水源为前提，不含新购整套泵站、高精度参考设备、论文费用及多节点扩展。压力报价超额或水源不能借用时须重编经费并落实条件，不能承诺2000元独立覆盖全部实物。借用和资助未落实前不填写为已具备；成员签字、导师与学校意见由本人及相应单位填写。</w:t>
+              <w:t>预算以已有电脑、借用参考仪器及可调连续水源为前提，不含整套泵站、新参考设备、论文费用与多节点。压力报价超额或水源不能借用时，须重编经费并落实条件。资源未落实不列为已具备；成员、导师及学校签字意见由本人和相应单位填写。</w:t>
             </w:r>
           </w:p>
         </w:tc>

</xml_diff>

<commit_message>
Rebuild bench concept as verified OCCT geometry with offline 3D views
</commit_message>
<xml_diff>
--- a/deliverables/大创申报书_模板填写稿.docx
+++ b/deliverables/大创申报书_模板填写稿.docx
@@ -3489,7 +3489,7 @@
                 <w:szCs w:val="28"/>
                 <w:lang w:val="en-US" w:eastAsia="zh-CN"/>
               </w:rPr>
-              <w:t>台架的物理布置与水力关系分别论证。图3按暂定900×520mm底板建立三维几何布局，将水路、侧向测压、独立计量杯和前侧干区节点分开，检查测点先后、操作可达性及回水路径。模型保留可复算几何源，管径、接头及器件包络目前是占位参数；采购后须校核装配尺寸、检修间距、固定与电气防护。这是已生成的设计模型，尚未制成台架。</w:t>
+              <w:t>台架的物理布置与水力关系分别论证。图3按暂定900×520mm底板、140mm管中心高度建立参数化装配概念，补充弯头、三通、活接、侧向取压、管夹支撑及采集盒。正常回水与泄漏收集分开，泄漏出口高于容器口20mm。模型保留STEP实体及彩色网格，另附俯视与局部交互视图。管径、器件包络及接头尺寸暂定，采购后须核定装配、检修空间和防护；尚未制造或实测。</w:t>
             </w:r>
           </w:p>
           <w:p>
@@ -3513,7 +3513,7 @@
                 <w:lang w:val="en-US" w:eastAsia="zh-CN"/>
               </w:rPr>
               <w:pict>
-                <v:shape id="_x0000_i1028" o:spt="75" alt="图3 双支路清水台架三维布置概念 器件尺寸待核定" type="#_x0000_t75" style="height:299pt;width:425pt;" filled="f" o:preferrelative="t" stroked="f" coordsize="21600,21600">
+                <v:shape id="_x0000_i1028" o:spt="75" alt="图3 双支路清水台架参数化装配布局 器件与安装尺寸待核定" type="#_x0000_t75" style="height:366.95pt;width:425pt;" filled="f" o:preferrelative="t" stroked="f" coordsize="21600,21600">
                   <v:path/>
                   <v:fill on="f" focussize="0,0"/>
                   <v:stroke on="f"/>
@@ -3540,7 +3540,7 @@
                 <w:szCs w:val="28"/>
                 <w:lang w:val="en-US" w:eastAsia="zh-CN"/>
               </w:rPr>
-              <w:t>图3 双支路清水台架三维布置概念 器件尺寸待核定</w:t>
+              <w:t>图3 双支路清水台架参数化装配布局 器件与安装尺寸待核定</w:t>
             </w:r>
           </w:p>
           <w:p>
@@ -5299,12 +5299,6 @@
                   <w:insideH w:val="none" w:color="auto" w:sz="0" w:space="0"/>
                   <w:insideV w:val="none" w:color="auto" w:sz="0" w:space="0"/>
                 </w:tblBorders>
-                <w:tblCellMar>
-                  <w:top w:w="0" w:type="dxa"/>
-                  <w:left w:w="0" w:type="dxa"/>
-                  <w:bottom w:w="0" w:type="dxa"/>
-                  <w:right w:w="0" w:type="dxa"/>
-                </w:tblCellMar>
               </w:tblPrEx>
               <w:trPr>
                 <w:cantSplit/>
@@ -9419,14 +9413,6 @@
                   </w:tr>
                   <w:tr>
                     <w:tblPrEx>
-                      <w:tblBorders>
-                        <w:top w:val="single" w:color="D9D9D9" w:sz="2" w:space="0"/>
-                        <w:left w:val="single" w:color="D9D9D9" w:sz="2" w:space="0"/>
-                        <w:bottom w:val="single" w:color="D9D9D9" w:sz="2" w:space="0"/>
-                        <w:right w:val="single" w:color="D9D9D9" w:sz="2" w:space="0"/>
-                        <w:insideH w:val="single" w:color="D9D9D9" w:sz="2" w:space="0"/>
-                        <w:insideV w:val="single" w:color="D9D9D9" w:sz="2" w:space="0"/>
-                      </w:tblBorders>
                       <w:tblCellMar>
                         <w:top w:w="60" w:type="dxa"/>
                         <w:left w:w="100" w:type="dxa"/>
@@ -9994,12 +9980,6 @@
                   <w:insideH w:val="none" w:color="auto" w:sz="0" w:space="0"/>
                   <w:insideV w:val="none" w:color="auto" w:sz="0" w:space="0"/>
                 </w:tblBorders>
-                <w:tblCellMar>
-                  <w:top w:w="0" w:type="dxa"/>
-                  <w:left w:w="0" w:type="dxa"/>
-                  <w:bottom w:w="0" w:type="dxa"/>
-                  <w:right w:w="0" w:type="dxa"/>
-                </w:tblCellMar>
               </w:tblPrEx>
               <w:trPr>
                 <w:cantSplit/>
@@ -10279,12 +10259,6 @@
                   <w:insideH w:val="none" w:color="auto" w:sz="0" w:space="0"/>
                   <w:insideV w:val="none" w:color="auto" w:sz="0" w:space="0"/>
                 </w:tblBorders>
-                <w:tblCellMar>
-                  <w:top w:w="0" w:type="dxa"/>
-                  <w:left w:w="0" w:type="dxa"/>
-                  <w:bottom w:w="0" w:type="dxa"/>
-                  <w:right w:w="0" w:type="dxa"/>
-                </w:tblCellMar>
               </w:tblPrEx>
               <w:trPr>
                 <w:cantSplit/>

</xml_diff>